<commit_message>
Align both synopses with the instrument as built
The passages have now been rebuilt to the three-minute exposure the synopsis
committed to, so the two documents no longer describe it as future work.

 - "The passages will accordingly be lengthened before the pilot" becomes the
   measured fact: four pages, about 600 words, 178 seconds of exposure.
 - The feasibility figure was a range across two possible passage lengths
   ("approximately 75 minutes at the present reading length and 93 at the
   three-minute exposure"). Passage length is now fixed, so the simulation gives
   one number: median 92 minutes, p95 112, 1.5 per cent over two hours.

Both .docx rebuilt and re-verified against Annexure AdtU/PhD/A(i).

Co-Authored-By: Claude Opus 5 <noreply@anthropic.com>
Claude-Session: https://claude.ai/code/session_01Y21CLUtoD2HT4KcbvaYcRZ
</commit_message>
<xml_diff>
--- a/synopsis/Synopsis_Gyandeep_Nath_AdtU.docx
+++ b/synopsis/Synopsis_Gyandeep_Nath_AdtU.docx
@@ -710,7 +710,79 @@
           <w:sz w:val="24"/>
           <w:szCs w:val="24"/>
         </w:rPr>
-        <w:t xml:space="preserve">The condition is common. A systematic review and meta-analysis of 103 cross-sectional studies covering 66,577 participants placed pooled prevalence at 69.0 per cent (95% CI 62.3–75.3), with individual estimates ranging from 12.1 to 97.3 per cent (Ccami-Bernal et al., 2024). Prevalence was higher among women (71.4 versus 61.8 per cent) and university students (76.1 per cent), and reviews report a further rise with remote work and study, reaching 50 to 60 per cent among children (Kaur et al., 2022; Sheppard &amp; Wolffsohn, 2018). The wide spread between studies is itself informative: case definitions remain unstandardised, and the prevalence synthesis closes by calling for one (Ccami-Bernal et al., 2024).</w:t>
+        <w:t xml:space="preserve">The condition is common. A systematic review and meta-analysis of 103 cross-sectional studies covering 66,577 participants placed pooled prevalence at 69.0 per cent (95% CI 62.3–75.3), with individual estimates ranging from 12.1 to 97.3 per cent (Ccami-Bernal </w:t>
+      </w:r>
+      <w:r>
+        <w:rPr>
+          <w:rFonts w:ascii="Times New Roman" w:cs="Times New Roman" w:eastAsia="Times New Roman" w:hAnsi="Times New Roman"/>
+          <w:b w:val="false"/>
+          <w:bCs w:val="false"/>
+          <w:i/>
+          <w:iCs/>
+          <w:sz w:val="24"/>
+          <w:szCs w:val="24"/>
+        </w:rPr>
+        <w:t xml:space="preserve">et al.</w:t>
+      </w:r>
+      <w:r>
+        <w:rPr>
+          <w:rFonts w:ascii="Times New Roman" w:cs="Times New Roman" w:eastAsia="Times New Roman" w:hAnsi="Times New Roman"/>
+          <w:b w:val="false"/>
+          <w:bCs w:val="false"/>
+          <w:i w:val="false"/>
+          <w:iCs w:val="false"/>
+          <w:sz w:val="24"/>
+          <w:szCs w:val="24"/>
+        </w:rPr>
+        <w:t xml:space="preserve">, 2024). Prevalence was higher among women (71.4 versus 61.8 per cent) and university students (76.1 per cent), and reviews report a further rise with remote work and study, reaching 50 to 60 per cent among children (Kaur </w:t>
+      </w:r>
+      <w:r>
+        <w:rPr>
+          <w:rFonts w:ascii="Times New Roman" w:cs="Times New Roman" w:eastAsia="Times New Roman" w:hAnsi="Times New Roman"/>
+          <w:b w:val="false"/>
+          <w:bCs w:val="false"/>
+          <w:i/>
+          <w:iCs/>
+          <w:sz w:val="24"/>
+          <w:szCs w:val="24"/>
+        </w:rPr>
+        <w:t xml:space="preserve">et al.</w:t>
+      </w:r>
+      <w:r>
+        <w:rPr>
+          <w:rFonts w:ascii="Times New Roman" w:cs="Times New Roman" w:eastAsia="Times New Roman" w:hAnsi="Times New Roman"/>
+          <w:b w:val="false"/>
+          <w:bCs w:val="false"/>
+          <w:i w:val="false"/>
+          <w:iCs w:val="false"/>
+          <w:sz w:val="24"/>
+          <w:szCs w:val="24"/>
+        </w:rPr>
+        <w:t xml:space="preserve">, 2022; Sheppard &amp; Wolffsohn, 2018). The wide spread between studies is itself informative: case definitions remain unstandardised, and the prevalence synthesis closes by calling for one (Ccami-Bernal </w:t>
+      </w:r>
+      <w:r>
+        <w:rPr>
+          <w:rFonts w:ascii="Times New Roman" w:cs="Times New Roman" w:eastAsia="Times New Roman" w:hAnsi="Times New Roman"/>
+          <w:b w:val="false"/>
+          <w:bCs w:val="false"/>
+          <w:i/>
+          <w:iCs/>
+          <w:sz w:val="24"/>
+          <w:szCs w:val="24"/>
+        </w:rPr>
+        <w:t xml:space="preserve">et al.</w:t>
+      </w:r>
+      <w:r>
+        <w:rPr>
+          <w:rFonts w:ascii="Times New Roman" w:cs="Times New Roman" w:eastAsia="Times New Roman" w:hAnsi="Times New Roman"/>
+          <w:b w:val="false"/>
+          <w:bCs w:val="false"/>
+          <w:i w:val="false"/>
+          <w:iCs w:val="false"/>
+          <w:sz w:val="24"/>
+          <w:szCs w:val="24"/>
+        </w:rPr>
+        <w:t xml:space="preserve">, 2024).</w:t>
       </w:r>
     </w:p>
     <w:p>
@@ -973,7 +1045,7 @@
           <w:sz w:val="24"/>
           <w:szCs w:val="24"/>
         </w:rPr>
-        <w:t xml:space="preserve">. An incomplete blink leaves part of the surface unwetted and unprotected, so the tear film thins and breaks up sooner, and the surface enters the recognised inflammatory cycle of dry eye disease (Fjaervoll et al., 2022; Kamøy et al., 2022). This is why the </w:t>
+        <w:t xml:space="preserve">. An incomplete blink leaves part of the surface unwetted and unprotected, so the tear film thins and breaks up sooner, and the surface enters the recognised inflammatory cycle of dry eye disease (Fjaervoll </w:t>
       </w:r>
       <w:r>
         <w:rPr>
@@ -985,6 +1057,54 @@
           <w:sz w:val="24"/>
           <w:szCs w:val="24"/>
         </w:rPr>
+        <w:t xml:space="preserve">et al.</w:t>
+      </w:r>
+      <w:r>
+        <w:rPr>
+          <w:rFonts w:ascii="Times New Roman" w:cs="Times New Roman" w:eastAsia="Times New Roman" w:hAnsi="Times New Roman"/>
+          <w:b w:val="false"/>
+          <w:bCs w:val="false"/>
+          <w:i w:val="false"/>
+          <w:iCs w:val="false"/>
+          <w:sz w:val="24"/>
+          <w:szCs w:val="24"/>
+        </w:rPr>
+        <w:t xml:space="preserve">, 2022; Kamøy </w:t>
+      </w:r>
+      <w:r>
+        <w:rPr>
+          <w:rFonts w:ascii="Times New Roman" w:cs="Times New Roman" w:eastAsia="Times New Roman" w:hAnsi="Times New Roman"/>
+          <w:b w:val="false"/>
+          <w:bCs w:val="false"/>
+          <w:i/>
+          <w:iCs/>
+          <w:sz w:val="24"/>
+          <w:szCs w:val="24"/>
+        </w:rPr>
+        <w:t xml:space="preserve">et al.</w:t>
+      </w:r>
+      <w:r>
+        <w:rPr>
+          <w:rFonts w:ascii="Times New Roman" w:cs="Times New Roman" w:eastAsia="Times New Roman" w:hAnsi="Times New Roman"/>
+          <w:b w:val="false"/>
+          <w:bCs w:val="false"/>
+          <w:i w:val="false"/>
+          <w:iCs w:val="false"/>
+          <w:sz w:val="24"/>
+          <w:szCs w:val="24"/>
+        </w:rPr>
+        <w:t xml:space="preserve">, 2022). This is why the </w:t>
+      </w:r>
+      <w:r>
+        <w:rPr>
+          <w:rFonts w:ascii="Times New Roman" w:cs="Times New Roman" w:eastAsia="Times New Roman" w:hAnsi="Times New Roman"/>
+          <w:b w:val="false"/>
+          <w:bCs w:val="false"/>
+          <w:i/>
+          <w:iCs/>
+          <w:sz w:val="24"/>
+          <w:szCs w:val="24"/>
+        </w:rPr>
         <w:t xml:space="preserve">completeness</w:t>
       </w:r>
       <w:r>
@@ -997,7 +1117,79 @@
           <w:sz w:val="24"/>
           <w:szCs w:val="24"/>
         </w:rPr>
-        <w:t xml:space="preserve"> of blinking, and not simply how often it occurs, is the ocular measure this study treats as primary. Mechanistic review attributes display-associated dry eye principally to impaired blinking, finding insufficient support for parasympathetic or blue-light contributions (Fjaervoll et al., 2022). The accommodative route is more heterogeneously evidenced but responds measurably to display parameters (Jiménez et al., 2020; Redondo et al., 2025). Although accommodative and vergence mechanisms are relevant to digital visual fatigue, the present study focuses on ocular-surface behaviour, visual performance and subjective fatigue, and does not measure accommodative responses directly; the accommodative pathway is therefore reviewed as mechanistic context rather than tested.</w:t>
+        <w:t xml:space="preserve"> of blinking, and not simply how often it occurs, is the ocular measure this study treats as primary. Mechanistic review attributes display-associated dry eye principally to impaired blinking, finding insufficient support for parasympathetic or blue-light contributions (Fjaervoll </w:t>
+      </w:r>
+      <w:r>
+        <w:rPr>
+          <w:rFonts w:ascii="Times New Roman" w:cs="Times New Roman" w:eastAsia="Times New Roman" w:hAnsi="Times New Roman"/>
+          <w:b w:val="false"/>
+          <w:bCs w:val="false"/>
+          <w:i/>
+          <w:iCs/>
+          <w:sz w:val="24"/>
+          <w:szCs w:val="24"/>
+        </w:rPr>
+        <w:t xml:space="preserve">et al.</w:t>
+      </w:r>
+      <w:r>
+        <w:rPr>
+          <w:rFonts w:ascii="Times New Roman" w:cs="Times New Roman" w:eastAsia="Times New Roman" w:hAnsi="Times New Roman"/>
+          <w:b w:val="false"/>
+          <w:bCs w:val="false"/>
+          <w:i w:val="false"/>
+          <w:iCs w:val="false"/>
+          <w:sz w:val="24"/>
+          <w:szCs w:val="24"/>
+        </w:rPr>
+        <w:t xml:space="preserve">, 2022). The accommodative route is more heterogeneously evidenced but responds measurably to display parameters (Jiménez </w:t>
+      </w:r>
+      <w:r>
+        <w:rPr>
+          <w:rFonts w:ascii="Times New Roman" w:cs="Times New Roman" w:eastAsia="Times New Roman" w:hAnsi="Times New Roman"/>
+          <w:b w:val="false"/>
+          <w:bCs w:val="false"/>
+          <w:i/>
+          <w:iCs/>
+          <w:sz w:val="24"/>
+          <w:szCs w:val="24"/>
+        </w:rPr>
+        <w:t xml:space="preserve">et al.</w:t>
+      </w:r>
+      <w:r>
+        <w:rPr>
+          <w:rFonts w:ascii="Times New Roman" w:cs="Times New Roman" w:eastAsia="Times New Roman" w:hAnsi="Times New Roman"/>
+          <w:b w:val="false"/>
+          <w:bCs w:val="false"/>
+          <w:i w:val="false"/>
+          <w:iCs w:val="false"/>
+          <w:sz w:val="24"/>
+          <w:szCs w:val="24"/>
+        </w:rPr>
+        <w:t xml:space="preserve">, 2020; Redondo </w:t>
+      </w:r>
+      <w:r>
+        <w:rPr>
+          <w:rFonts w:ascii="Times New Roman" w:cs="Times New Roman" w:eastAsia="Times New Roman" w:hAnsi="Times New Roman"/>
+          <w:b w:val="false"/>
+          <w:bCs w:val="false"/>
+          <w:i/>
+          <w:iCs/>
+          <w:sz w:val="24"/>
+          <w:szCs w:val="24"/>
+        </w:rPr>
+        <w:t xml:space="preserve">et al.</w:t>
+      </w:r>
+      <w:r>
+        <w:rPr>
+          <w:rFonts w:ascii="Times New Roman" w:cs="Times New Roman" w:eastAsia="Times New Roman" w:hAnsi="Times New Roman"/>
+          <w:b w:val="false"/>
+          <w:bCs w:val="false"/>
+          <w:i w:val="false"/>
+          <w:iCs w:val="false"/>
+          <w:sz w:val="24"/>
+          <w:szCs w:val="24"/>
+        </w:rPr>
+        <w:t xml:space="preserve">, 2025). Although accommodative and vergence mechanisms are relevant to digital visual fatigue, the present study focuses on ocular-surface behaviour, visual performance and subjective fatigue, and does not measure accommodative responses directly; the accommodative pathway is therefore reviewed as mechanistic context rather than tested.</w:t>
       </w:r>
     </w:p>
     <w:p>
@@ -1078,7 +1270,127 @@
           <w:sz w:val="24"/>
           <w:szCs w:val="24"/>
         </w:rPr>
-        <w:t xml:space="preserve">: reading is better for dark text on a light field than for light text on a dark one. The accepted explanation runs through the pupil. A positive-polarity screen is mostly white, so it emits more light overall; more light entering the eye makes the pupil constrict; a smaller pupil admits light through the central, optically cleaner part of the lens and increases the range of distances held in focus; and the retinal image is consequently sharper (Buchner &amp; Baumgartner, 2007; Piepenbrock et al., 2014a, 2014b). The advantage, in other words, is thought to be a matter of how much light the screen puts out rather than of colour preference. Text colour has been studied far less and, to the best of the available evidence, no study has comprehensively evaluated it in combination with polarity while measuring fatigue (Fan et al., 2024; Jiménez et al., 2020). Any manipulation of text colour also manipulates luminance contrast, since chromatic pigments differ intrinsically in relative luminance and chromatic contrast cannot substitute for luminance contrast (Buchner &amp; Baumgartner, 2007), so an apparent effect of colour may be an effect of contrast unless the two are measured separately. Ambient light adds veiling luminance and drives pupil size independently of the display, interacting with the same mechanism (Dobres et al., 2017; Fan et al., 2024).</w:t>
+        <w:t xml:space="preserve">: reading is better for dark text on a light field than for light text on a dark one. The accepted explanation runs through the pupil. A positive-polarity screen is mostly white, so it emits more light overall; more light entering the eye makes the pupil constrict; a smaller pupil admits light through the central, optically cleaner part of the lens and increases the range of distances held in focus; and the retinal image is consequently sharper (Buchner &amp; Baumgartner, 2007; Piepenbrock </w:t>
+      </w:r>
+      <w:r>
+        <w:rPr>
+          <w:rFonts w:ascii="Times New Roman" w:cs="Times New Roman" w:eastAsia="Times New Roman" w:hAnsi="Times New Roman"/>
+          <w:b w:val="false"/>
+          <w:bCs w:val="false"/>
+          <w:i/>
+          <w:iCs/>
+          <w:sz w:val="24"/>
+          <w:szCs w:val="24"/>
+        </w:rPr>
+        <w:t xml:space="preserve">et al.</w:t>
+      </w:r>
+      <w:r>
+        <w:rPr>
+          <w:rFonts w:ascii="Times New Roman" w:cs="Times New Roman" w:eastAsia="Times New Roman" w:hAnsi="Times New Roman"/>
+          <w:b w:val="false"/>
+          <w:bCs w:val="false"/>
+          <w:i w:val="false"/>
+          <w:iCs w:val="false"/>
+          <w:sz w:val="24"/>
+          <w:szCs w:val="24"/>
+        </w:rPr>
+        <w:t xml:space="preserve">, 2014a, 2014b). The advantage, in other words, is thought to be a matter of how much light the screen puts out rather than of colour preference. Text colour has been studied far less and, to the best of the available evidence, no study has comprehensively evaluated it in combination with polarity while measuring fatigue (Fan </w:t>
+      </w:r>
+      <w:r>
+        <w:rPr>
+          <w:rFonts w:ascii="Times New Roman" w:cs="Times New Roman" w:eastAsia="Times New Roman" w:hAnsi="Times New Roman"/>
+          <w:b w:val="false"/>
+          <w:bCs w:val="false"/>
+          <w:i/>
+          <w:iCs/>
+          <w:sz w:val="24"/>
+          <w:szCs w:val="24"/>
+        </w:rPr>
+        <w:t xml:space="preserve">et al.</w:t>
+      </w:r>
+      <w:r>
+        <w:rPr>
+          <w:rFonts w:ascii="Times New Roman" w:cs="Times New Roman" w:eastAsia="Times New Roman" w:hAnsi="Times New Roman"/>
+          <w:b w:val="false"/>
+          <w:bCs w:val="false"/>
+          <w:i w:val="false"/>
+          <w:iCs w:val="false"/>
+          <w:sz w:val="24"/>
+          <w:szCs w:val="24"/>
+        </w:rPr>
+        <w:t xml:space="preserve">, 2024; Jiménez </w:t>
+      </w:r>
+      <w:r>
+        <w:rPr>
+          <w:rFonts w:ascii="Times New Roman" w:cs="Times New Roman" w:eastAsia="Times New Roman" w:hAnsi="Times New Roman"/>
+          <w:b w:val="false"/>
+          <w:bCs w:val="false"/>
+          <w:i/>
+          <w:iCs/>
+          <w:sz w:val="24"/>
+          <w:szCs w:val="24"/>
+        </w:rPr>
+        <w:t xml:space="preserve">et al.</w:t>
+      </w:r>
+      <w:r>
+        <w:rPr>
+          <w:rFonts w:ascii="Times New Roman" w:cs="Times New Roman" w:eastAsia="Times New Roman" w:hAnsi="Times New Roman"/>
+          <w:b w:val="false"/>
+          <w:bCs w:val="false"/>
+          <w:i w:val="false"/>
+          <w:iCs w:val="false"/>
+          <w:sz w:val="24"/>
+          <w:szCs w:val="24"/>
+        </w:rPr>
+        <w:t xml:space="preserve">, 2020). Any manipulation of text colour also manipulates luminance contrast, since chromatic pigments differ intrinsically in relative luminance and chromatic contrast cannot substitute for luminance contrast (Buchner &amp; Baumgartner, 2007), so an apparent effect of colour may be an effect of contrast unless the two are measured separately. Ambient light adds veiling luminance and drives pupil size independently of the display, interacting with the same mechanism (Dobres </w:t>
+      </w:r>
+      <w:r>
+        <w:rPr>
+          <w:rFonts w:ascii="Times New Roman" w:cs="Times New Roman" w:eastAsia="Times New Roman" w:hAnsi="Times New Roman"/>
+          <w:b w:val="false"/>
+          <w:bCs w:val="false"/>
+          <w:i/>
+          <w:iCs/>
+          <w:sz w:val="24"/>
+          <w:szCs w:val="24"/>
+        </w:rPr>
+        <w:t xml:space="preserve">et al.</w:t>
+      </w:r>
+      <w:r>
+        <w:rPr>
+          <w:rFonts w:ascii="Times New Roman" w:cs="Times New Roman" w:eastAsia="Times New Roman" w:hAnsi="Times New Roman"/>
+          <w:b w:val="false"/>
+          <w:bCs w:val="false"/>
+          <w:i w:val="false"/>
+          <w:iCs w:val="false"/>
+          <w:sz w:val="24"/>
+          <w:szCs w:val="24"/>
+        </w:rPr>
+        <w:t xml:space="preserve">, 2017; Fan </w:t>
+      </w:r>
+      <w:r>
+        <w:rPr>
+          <w:rFonts w:ascii="Times New Roman" w:cs="Times New Roman" w:eastAsia="Times New Roman" w:hAnsi="Times New Roman"/>
+          <w:b w:val="false"/>
+          <w:bCs w:val="false"/>
+          <w:i/>
+          <w:iCs/>
+          <w:sz w:val="24"/>
+          <w:szCs w:val="24"/>
+        </w:rPr>
+        <w:t xml:space="preserve">et al.</w:t>
+      </w:r>
+      <w:r>
+        <w:rPr>
+          <w:rFonts w:ascii="Times New Roman" w:cs="Times New Roman" w:eastAsia="Times New Roman" w:hAnsi="Times New Roman"/>
+          <w:b w:val="false"/>
+          <w:bCs w:val="false"/>
+          <w:i w:val="false"/>
+          <w:iCs w:val="false"/>
+          <w:sz w:val="24"/>
+          <w:szCs w:val="24"/>
+        </w:rPr>
+        <w:t xml:space="preserve">, 2024).</w:t>
       </w:r>
     </w:p>
     <w:p>
@@ -1116,7 +1428,79 @@
           <w:sz w:val="24"/>
           <w:szCs w:val="24"/>
         </w:rPr>
-        <w:t xml:space="preserve">Roughly seven in ten screen users report symptoms of digital eye strain (Ccami-Bernal et al., 2024), yet the remedies most heavily promoted for it lack trial support. A systematic review and meta-analysis of 45 randomised controlled trials involving 4,497 participants found no high-certainty evidence for any therapy examined, including blue-blocking lenses, with only low-certainty benefit for oral omega-3 in dry-eye symptoms (Singh et al., 2022). A separate review in younger users reached the same conclusion on blue-blocking filters, supporting ergonomic optimisation and shorter exposure instead (Mataftsi et al., 2023).</w:t>
+        <w:t xml:space="preserve">Roughly seven in ten screen users report symptoms of digital eye strain (Ccami-Bernal </w:t>
+      </w:r>
+      <w:r>
+        <w:rPr>
+          <w:rFonts w:ascii="Times New Roman" w:cs="Times New Roman" w:eastAsia="Times New Roman" w:hAnsi="Times New Roman"/>
+          <w:b w:val="false"/>
+          <w:bCs w:val="false"/>
+          <w:i/>
+          <w:iCs/>
+          <w:sz w:val="24"/>
+          <w:szCs w:val="24"/>
+        </w:rPr>
+        <w:t xml:space="preserve">et al.</w:t>
+      </w:r>
+      <w:r>
+        <w:rPr>
+          <w:rFonts w:ascii="Times New Roman" w:cs="Times New Roman" w:eastAsia="Times New Roman" w:hAnsi="Times New Roman"/>
+          <w:b w:val="false"/>
+          <w:bCs w:val="false"/>
+          <w:i w:val="false"/>
+          <w:iCs w:val="false"/>
+          <w:sz w:val="24"/>
+          <w:szCs w:val="24"/>
+        </w:rPr>
+        <w:t xml:space="preserve">, 2024), yet the remedies most heavily promoted for it lack trial support. A systematic review and meta-analysis of 45 randomised controlled trials involving 4,497 participants found no high-certainty evidence for any therapy examined, including blue-blocking lenses, with only low-certainty benefit for oral omega-3 in dry-eye symptoms (Singh </w:t>
+      </w:r>
+      <w:r>
+        <w:rPr>
+          <w:rFonts w:ascii="Times New Roman" w:cs="Times New Roman" w:eastAsia="Times New Roman" w:hAnsi="Times New Roman"/>
+          <w:b w:val="false"/>
+          <w:bCs w:val="false"/>
+          <w:i/>
+          <w:iCs/>
+          <w:sz w:val="24"/>
+          <w:szCs w:val="24"/>
+        </w:rPr>
+        <w:t xml:space="preserve">et al.</w:t>
+      </w:r>
+      <w:r>
+        <w:rPr>
+          <w:rFonts w:ascii="Times New Roman" w:cs="Times New Roman" w:eastAsia="Times New Roman" w:hAnsi="Times New Roman"/>
+          <w:b w:val="false"/>
+          <w:bCs w:val="false"/>
+          <w:i w:val="false"/>
+          <w:iCs w:val="false"/>
+          <w:sz w:val="24"/>
+          <w:szCs w:val="24"/>
+        </w:rPr>
+        <w:t xml:space="preserve">, 2022). A separate review in younger users reached the same conclusion on blue-blocking filters, supporting ergonomic optimisation and shorter exposure instead (Mataftsi </w:t>
+      </w:r>
+      <w:r>
+        <w:rPr>
+          <w:rFonts w:ascii="Times New Roman" w:cs="Times New Roman" w:eastAsia="Times New Roman" w:hAnsi="Times New Roman"/>
+          <w:b w:val="false"/>
+          <w:bCs w:val="false"/>
+          <w:i/>
+          <w:iCs/>
+          <w:sz w:val="24"/>
+          <w:szCs w:val="24"/>
+        </w:rPr>
+        <w:t xml:space="preserve">et al.</w:t>
+      </w:r>
+      <w:r>
+        <w:rPr>
+          <w:rFonts w:ascii="Times New Roman" w:cs="Times New Roman" w:eastAsia="Times New Roman" w:hAnsi="Times New Roman"/>
+          <w:b w:val="false"/>
+          <w:bCs w:val="false"/>
+          <w:i w:val="false"/>
+          <w:iCs w:val="false"/>
+          <w:sz w:val="24"/>
+          <w:szCs w:val="24"/>
+        </w:rPr>
+        <w:t xml:space="preserve">, 2023).</w:t>
       </w:r>
     </w:p>
     <w:p>
@@ -1135,7 +1519,127 @@
           <w:sz w:val="24"/>
           <w:szCs w:val="24"/>
         </w:rPr>
-        <w:t xml:space="preserve">The properties of the displayed stimulus are upstream of the visual load, cost nothing to change and can be deployed universally, yet remain the least investigated. Work on polarity is confined to brief, threshold-limited tasks using achromatic text, and does not extend to prolonged reading, blinking behaviour or validated symptom measurement. Work on text colour is limited to short exposures without symptom outcomes (Jiménez et al., 2020), or to a single polarity (Fan et al., 2024). No study has therefore estimated how polarity and text colour interact, separated hue from luminance contrast, crossed either with ambient illumination, or measured a validated symptom instrument alongside the ocular marker most specific to this condition. Compounding this, blink completeness has been measured by frame-by-frame manual annotation, restricting the literature to samples of eleven to fifty participants (Argilés et al., 2015; Hirota et al., 2013; Portello et al., 2013).</w:t>
+        <w:t xml:space="preserve">The properties of the displayed stimulus are upstream of the visual load, cost nothing to change and can be deployed universally, yet remain the least investigated. Work on polarity is confined to brief, threshold-limited tasks using achromatic text, and does not extend to prolonged reading, blinking behaviour or validated symptom measurement. Work on text colour is limited to short exposures without symptom outcomes (Jiménez </w:t>
+      </w:r>
+      <w:r>
+        <w:rPr>
+          <w:rFonts w:ascii="Times New Roman" w:cs="Times New Roman" w:eastAsia="Times New Roman" w:hAnsi="Times New Roman"/>
+          <w:b w:val="false"/>
+          <w:bCs w:val="false"/>
+          <w:i/>
+          <w:iCs/>
+          <w:sz w:val="24"/>
+          <w:szCs w:val="24"/>
+        </w:rPr>
+        <w:t xml:space="preserve">et al.</w:t>
+      </w:r>
+      <w:r>
+        <w:rPr>
+          <w:rFonts w:ascii="Times New Roman" w:cs="Times New Roman" w:eastAsia="Times New Roman" w:hAnsi="Times New Roman"/>
+          <w:b w:val="false"/>
+          <w:bCs w:val="false"/>
+          <w:i w:val="false"/>
+          <w:iCs w:val="false"/>
+          <w:sz w:val="24"/>
+          <w:szCs w:val="24"/>
+        </w:rPr>
+        <w:t xml:space="preserve">, 2020), or to a single polarity (Fan </w:t>
+      </w:r>
+      <w:r>
+        <w:rPr>
+          <w:rFonts w:ascii="Times New Roman" w:cs="Times New Roman" w:eastAsia="Times New Roman" w:hAnsi="Times New Roman"/>
+          <w:b w:val="false"/>
+          <w:bCs w:val="false"/>
+          <w:i/>
+          <w:iCs/>
+          <w:sz w:val="24"/>
+          <w:szCs w:val="24"/>
+        </w:rPr>
+        <w:t xml:space="preserve">et al.</w:t>
+      </w:r>
+      <w:r>
+        <w:rPr>
+          <w:rFonts w:ascii="Times New Roman" w:cs="Times New Roman" w:eastAsia="Times New Roman" w:hAnsi="Times New Roman"/>
+          <w:b w:val="false"/>
+          <w:bCs w:val="false"/>
+          <w:i w:val="false"/>
+          <w:iCs w:val="false"/>
+          <w:sz w:val="24"/>
+          <w:szCs w:val="24"/>
+        </w:rPr>
+        <w:t xml:space="preserve">, 2024). No study has therefore estimated how polarity and text colour interact, separated hue from luminance contrast, crossed either with ambient illumination, or measured a validated symptom instrument alongside the ocular marker most specific to this condition. Compounding this, blink completeness has been measured by frame-by-frame manual annotation, restricting the literature to samples of eleven to fifty participants (Argilés </w:t>
+      </w:r>
+      <w:r>
+        <w:rPr>
+          <w:rFonts w:ascii="Times New Roman" w:cs="Times New Roman" w:eastAsia="Times New Roman" w:hAnsi="Times New Roman"/>
+          <w:b w:val="false"/>
+          <w:bCs w:val="false"/>
+          <w:i/>
+          <w:iCs/>
+          <w:sz w:val="24"/>
+          <w:szCs w:val="24"/>
+        </w:rPr>
+        <w:t xml:space="preserve">et al.</w:t>
+      </w:r>
+      <w:r>
+        <w:rPr>
+          <w:rFonts w:ascii="Times New Roman" w:cs="Times New Roman" w:eastAsia="Times New Roman" w:hAnsi="Times New Roman"/>
+          <w:b w:val="false"/>
+          <w:bCs w:val="false"/>
+          <w:i w:val="false"/>
+          <w:iCs w:val="false"/>
+          <w:sz w:val="24"/>
+          <w:szCs w:val="24"/>
+        </w:rPr>
+        <w:t xml:space="preserve">, 2015; Hirota </w:t>
+      </w:r>
+      <w:r>
+        <w:rPr>
+          <w:rFonts w:ascii="Times New Roman" w:cs="Times New Roman" w:eastAsia="Times New Roman" w:hAnsi="Times New Roman"/>
+          <w:b w:val="false"/>
+          <w:bCs w:val="false"/>
+          <w:i/>
+          <w:iCs/>
+          <w:sz w:val="24"/>
+          <w:szCs w:val="24"/>
+        </w:rPr>
+        <w:t xml:space="preserve">et al.</w:t>
+      </w:r>
+      <w:r>
+        <w:rPr>
+          <w:rFonts w:ascii="Times New Roman" w:cs="Times New Roman" w:eastAsia="Times New Roman" w:hAnsi="Times New Roman"/>
+          <w:b w:val="false"/>
+          <w:bCs w:val="false"/>
+          <w:i w:val="false"/>
+          <w:iCs w:val="false"/>
+          <w:sz w:val="24"/>
+          <w:szCs w:val="24"/>
+        </w:rPr>
+        <w:t xml:space="preserve">, 2013; Portello </w:t>
+      </w:r>
+      <w:r>
+        <w:rPr>
+          <w:rFonts w:ascii="Times New Roman" w:cs="Times New Roman" w:eastAsia="Times New Roman" w:hAnsi="Times New Roman"/>
+          <w:b w:val="false"/>
+          <w:bCs w:val="false"/>
+          <w:i/>
+          <w:iCs/>
+          <w:sz w:val="24"/>
+          <w:szCs w:val="24"/>
+        </w:rPr>
+        <w:t xml:space="preserve">et al.</w:t>
+      </w:r>
+      <w:r>
+        <w:rPr>
+          <w:rFonts w:ascii="Times New Roman" w:cs="Times New Roman" w:eastAsia="Times New Roman" w:hAnsi="Times New Roman"/>
+          <w:b w:val="false"/>
+          <w:bCs w:val="false"/>
+          <w:i w:val="false"/>
+          <w:iCs w:val="false"/>
+          <w:sz w:val="24"/>
+          <w:szCs w:val="24"/>
+        </w:rPr>
+        <w:t xml:space="preserve">, 2013).</w:t>
       </w:r>
     </w:p>
     <w:p>
@@ -1230,7 +1734,31 @@
           <w:sz w:val="24"/>
           <w:szCs w:val="24"/>
         </w:rPr>
-        <w:t xml:space="preserve">Manipulating ambient light across sessions tests the polarity effect where it matters behaviourally, since devices are used extensively at night and in dim domestic settings, where negative polarity is predicted to cost most (Dobres et al., 2017). Validating an automated measure of blink completeness would remove the annotation bottleneck that has kept this literature small. The findings bear on interface design, on accessibility standards whose contrast criterion does not account for polarity (Advanced Perceptual Contrast Algorithm, n.d.; World Wide Web Consortium, 2023), on public health guidance, and on the advice optometrists give patients, an area in which practitioners are documented to lack quality evidence (Sheppard &amp; Wolffsohn, 2018).</w:t>
+        <w:t xml:space="preserve">Manipulating ambient light across sessions tests the polarity effect where it matters behaviourally, since devices are used extensively at night and in dim domestic settings, where negative polarity is predicted to cost most (Dobres </w:t>
+      </w:r>
+      <w:r>
+        <w:rPr>
+          <w:rFonts w:ascii="Times New Roman" w:cs="Times New Roman" w:eastAsia="Times New Roman" w:hAnsi="Times New Roman"/>
+          <w:b w:val="false"/>
+          <w:bCs w:val="false"/>
+          <w:i/>
+          <w:iCs/>
+          <w:sz w:val="24"/>
+          <w:szCs w:val="24"/>
+        </w:rPr>
+        <w:t xml:space="preserve">et al.</w:t>
+      </w:r>
+      <w:r>
+        <w:rPr>
+          <w:rFonts w:ascii="Times New Roman" w:cs="Times New Roman" w:eastAsia="Times New Roman" w:hAnsi="Times New Roman"/>
+          <w:b w:val="false"/>
+          <w:bCs w:val="false"/>
+          <w:i w:val="false"/>
+          <w:iCs w:val="false"/>
+          <w:sz w:val="24"/>
+          <w:szCs w:val="24"/>
+        </w:rPr>
+        <w:t xml:space="preserve">, 2017). Validating an automated measure of blink completeness would remove the annotation bottleneck that has kept this literature small. The findings bear on interface design, on accessibility standards whose contrast criterion does not account for polarity (Advanced Perceptual Contrast Algorithm, n.d.; World Wide Web Consortium, 2023), on public health guidance, and on the advice optometrists give patients, an area in which practitioners are documented to lack quality evidence (Sheppard &amp; Wolffsohn, 2018).</w:t>
       </w:r>
     </w:p>
     <w:p>
@@ -1627,7 +2155,31 @@
           <w:sz w:val="24"/>
           <w:szCs w:val="24"/>
         </w:rPr>
-        <w:t xml:space="preserve"> The effect of text colour depends on polarity, and the cost of negative polarity is greater under dim than under moderate illumination (Dobres et al., 2017).</w:t>
+        <w:t xml:space="preserve"> The effect of text colour depends on polarity, and the cost of negative polarity is greater under dim than under moderate illumination (Dobres </w:t>
+      </w:r>
+      <w:r>
+        <w:rPr>
+          <w:rFonts w:ascii="Times New Roman" w:cs="Times New Roman" w:eastAsia="Times New Roman" w:hAnsi="Times New Roman"/>
+          <w:b w:val="false"/>
+          <w:bCs w:val="false"/>
+          <w:i/>
+          <w:iCs/>
+          <w:sz w:val="24"/>
+          <w:szCs w:val="24"/>
+        </w:rPr>
+        <w:t xml:space="preserve">et al.</w:t>
+      </w:r>
+      <w:r>
+        <w:rPr>
+          <w:rFonts w:ascii="Times New Roman" w:cs="Times New Roman" w:eastAsia="Times New Roman" w:hAnsi="Times New Roman"/>
+          <w:b w:val="false"/>
+          <w:bCs w:val="false"/>
+          <w:i w:val="false"/>
+          <w:iCs w:val="false"/>
+          <w:sz w:val="24"/>
+          <w:szCs w:val="24"/>
+        </w:rPr>
+        <w:t xml:space="preserve">, 2017).</w:t>
       </w:r>
     </w:p>
     <w:p>
@@ -1658,7 +2210,31 @@
           <w:sz w:val="24"/>
           <w:szCs w:val="24"/>
         </w:rPr>
-        <w:t xml:space="preserve"> Colour-related variance is largely accounted for by luminance contrast. Because the computed contrast ordering reverses between the two polarities (Table 3.4), a contrast-mediated effect predicts a corresponding reversal of the colour ordering across polarity, whereas a residual hue-specific effect predicts a consistent ordering, with red the a priori candidate exception (Fan et al., 2024).</w:t>
+        <w:t xml:space="preserve"> Colour-related variance is largely accounted for by luminance contrast. Because the computed contrast ordering reverses between the two polarities (Table 3.4), a contrast-mediated effect predicts a corresponding reversal of the colour ordering across polarity, whereas a residual hue-specific effect predicts a consistent ordering, with red the a priori candidate exception (Fan </w:t>
+      </w:r>
+      <w:r>
+        <w:rPr>
+          <w:rFonts w:ascii="Times New Roman" w:cs="Times New Roman" w:eastAsia="Times New Roman" w:hAnsi="Times New Roman"/>
+          <w:b w:val="false"/>
+          <w:bCs w:val="false"/>
+          <w:i/>
+          <w:iCs/>
+          <w:sz w:val="24"/>
+          <w:szCs w:val="24"/>
+        </w:rPr>
+        <w:t xml:space="preserve">et al.</w:t>
+      </w:r>
+      <w:r>
+        <w:rPr>
+          <w:rFonts w:ascii="Times New Roman" w:cs="Times New Roman" w:eastAsia="Times New Roman" w:hAnsi="Times New Roman"/>
+          <w:b w:val="false"/>
+          <w:bCs w:val="false"/>
+          <w:i w:val="false"/>
+          <w:iCs w:val="false"/>
+          <w:sz w:val="24"/>
+          <w:szCs w:val="24"/>
+        </w:rPr>
+        <w:t xml:space="preserve">, 2024).</w:t>
       </w:r>
     </w:p>
     <w:p>
@@ -1727,7 +2303,55 @@
           <w:sz w:val="24"/>
           <w:szCs w:val="24"/>
         </w:rPr>
-        <w:t xml:space="preserve">Display configuration and ambient illuminance act through two proximal mechanisms, summarised in Table 1.1. Along the optical route, display and room luminance determine pupil diameter, which governs aberration and depth of focus and therefore retinal image quality, legibility and accommodative demand. Along the ocular-surface route, visual and cognitive demand suppress blink rate and raise incomplete blinking, destabilising the tear film. Both routes feed the manifest outcomes of reading rate, comprehension, visual search, sustained attention, perceived comfort, workload and subjective fatigue. Time on task exerts its own effect and is counterbalanced and modelled (Abe et al., 2014; Warm et al., 2008); sleepiness, indexed by PERCLOS, and disengagement are treated as measured confounders; participant characteristics modulate susceptibility throughout.</w:t>
+        <w:t xml:space="preserve">Display configuration and ambient illuminance act through two proximal mechanisms, summarised in Table 1.1. Along the optical route, display and room luminance determine pupil diameter, which governs aberration and depth of focus and therefore retinal image quality, legibility and accommodative demand. Along the ocular-surface route, visual and cognitive demand suppress blink rate and raise incomplete blinking, destabilising the tear film. Both routes feed the manifest outcomes of reading rate, comprehension, visual search, sustained attention, perceived comfort, workload and subjective fatigue. Time on task exerts its own effect and is counterbalanced and modelled (Abe </w:t>
+      </w:r>
+      <w:r>
+        <w:rPr>
+          <w:rFonts w:ascii="Times New Roman" w:cs="Times New Roman" w:eastAsia="Times New Roman" w:hAnsi="Times New Roman"/>
+          <w:b w:val="false"/>
+          <w:bCs w:val="false"/>
+          <w:i/>
+          <w:iCs/>
+          <w:sz w:val="24"/>
+          <w:szCs w:val="24"/>
+        </w:rPr>
+        <w:t xml:space="preserve">et al.</w:t>
+      </w:r>
+      <w:r>
+        <w:rPr>
+          <w:rFonts w:ascii="Times New Roman" w:cs="Times New Roman" w:eastAsia="Times New Roman" w:hAnsi="Times New Roman"/>
+          <w:b w:val="false"/>
+          <w:bCs w:val="false"/>
+          <w:i w:val="false"/>
+          <w:iCs w:val="false"/>
+          <w:sz w:val="24"/>
+          <w:szCs w:val="24"/>
+        </w:rPr>
+        <w:t xml:space="preserve">, 2014; Warm </w:t>
+      </w:r>
+      <w:r>
+        <w:rPr>
+          <w:rFonts w:ascii="Times New Roman" w:cs="Times New Roman" w:eastAsia="Times New Roman" w:hAnsi="Times New Roman"/>
+          <w:b w:val="false"/>
+          <w:bCs w:val="false"/>
+          <w:i/>
+          <w:iCs/>
+          <w:sz w:val="24"/>
+          <w:szCs w:val="24"/>
+        </w:rPr>
+        <w:t xml:space="preserve">et al.</w:t>
+      </w:r>
+      <w:r>
+        <w:rPr>
+          <w:rFonts w:ascii="Times New Roman" w:cs="Times New Roman" w:eastAsia="Times New Roman" w:hAnsi="Times New Roman"/>
+          <w:b w:val="false"/>
+          <w:bCs w:val="false"/>
+          <w:i w:val="false"/>
+          <w:iCs w:val="false"/>
+          <w:sz w:val="24"/>
+          <w:szCs w:val="24"/>
+        </w:rPr>
+        <w:t xml:space="preserve">, 2008); sleepiness, indexed by PERCLOS, and disengagement are treated as measured confounders; participant characteristics modulate susceptibility throughout.</w:t>
       </w:r>
     </w:p>
     <w:p>
@@ -2171,7 +2795,103 @@
                 <w:sz w:val="15"/>
                 <w:szCs w:val="15"/>
               </w:rPr>
-              <w:t xml:space="preserve">(Dobres et al., 2017; Jiménez et al., 2020; Piepenbrock et al., 2014a, 2014b; Redondo et al., 2025)</w:t>
+              <w:t xml:space="preserve">(Dobres </w:t>
+            </w:r>
+            <w:r>
+              <w:rPr>
+                <w:rFonts w:ascii="Times New Roman" w:cs="Times New Roman" w:eastAsia="Times New Roman" w:hAnsi="Times New Roman"/>
+                <w:b w:val="false"/>
+                <w:bCs w:val="false"/>
+                <w:i/>
+                <w:iCs/>
+                <w:sz w:val="15"/>
+                <w:szCs w:val="15"/>
+              </w:rPr>
+              <w:t xml:space="preserve">et al.</w:t>
+            </w:r>
+            <w:r>
+              <w:rPr>
+                <w:rFonts w:ascii="Times New Roman" w:cs="Times New Roman" w:eastAsia="Times New Roman" w:hAnsi="Times New Roman"/>
+                <w:b w:val="false"/>
+                <w:bCs w:val="false"/>
+                <w:i w:val="false"/>
+                <w:iCs w:val="false"/>
+                <w:sz w:val="15"/>
+                <w:szCs w:val="15"/>
+              </w:rPr>
+              <w:t xml:space="preserve">, 2017; Jiménez </w:t>
+            </w:r>
+            <w:r>
+              <w:rPr>
+                <w:rFonts w:ascii="Times New Roman" w:cs="Times New Roman" w:eastAsia="Times New Roman" w:hAnsi="Times New Roman"/>
+                <w:b w:val="false"/>
+                <w:bCs w:val="false"/>
+                <w:i/>
+                <w:iCs/>
+                <w:sz w:val="15"/>
+                <w:szCs w:val="15"/>
+              </w:rPr>
+              <w:t xml:space="preserve">et al.</w:t>
+            </w:r>
+            <w:r>
+              <w:rPr>
+                <w:rFonts w:ascii="Times New Roman" w:cs="Times New Roman" w:eastAsia="Times New Roman" w:hAnsi="Times New Roman"/>
+                <w:b w:val="false"/>
+                <w:bCs w:val="false"/>
+                <w:i w:val="false"/>
+                <w:iCs w:val="false"/>
+                <w:sz w:val="15"/>
+                <w:szCs w:val="15"/>
+              </w:rPr>
+              <w:t xml:space="preserve">, 2020; Piepenbrock </w:t>
+            </w:r>
+            <w:r>
+              <w:rPr>
+                <w:rFonts w:ascii="Times New Roman" w:cs="Times New Roman" w:eastAsia="Times New Roman" w:hAnsi="Times New Roman"/>
+                <w:b w:val="false"/>
+                <w:bCs w:val="false"/>
+                <w:i/>
+                <w:iCs/>
+                <w:sz w:val="15"/>
+                <w:szCs w:val="15"/>
+              </w:rPr>
+              <w:t xml:space="preserve">et al.</w:t>
+            </w:r>
+            <w:r>
+              <w:rPr>
+                <w:rFonts w:ascii="Times New Roman" w:cs="Times New Roman" w:eastAsia="Times New Roman" w:hAnsi="Times New Roman"/>
+                <w:b w:val="false"/>
+                <w:bCs w:val="false"/>
+                <w:i w:val="false"/>
+                <w:iCs w:val="false"/>
+                <w:sz w:val="15"/>
+                <w:szCs w:val="15"/>
+              </w:rPr>
+              <w:t xml:space="preserve">, 2014a, 2014b; Redondo </w:t>
+            </w:r>
+            <w:r>
+              <w:rPr>
+                <w:rFonts w:ascii="Times New Roman" w:cs="Times New Roman" w:eastAsia="Times New Roman" w:hAnsi="Times New Roman"/>
+                <w:b w:val="false"/>
+                <w:bCs w:val="false"/>
+                <w:i/>
+                <w:iCs/>
+                <w:sz w:val="15"/>
+                <w:szCs w:val="15"/>
+              </w:rPr>
+              <w:t xml:space="preserve">et al.</w:t>
+            </w:r>
+            <w:r>
+              <w:rPr>
+                <w:rFonts w:ascii="Times New Roman" w:cs="Times New Roman" w:eastAsia="Times New Roman" w:hAnsi="Times New Roman"/>
+                <w:b w:val="false"/>
+                <w:bCs w:val="false"/>
+                <w:i w:val="false"/>
+                <w:iCs w:val="false"/>
+                <w:sz w:val="15"/>
+                <w:szCs w:val="15"/>
+              </w:rPr>
+              <w:t xml:space="preserve">, 2025)</w:t>
             </w:r>
           </w:p>
         </w:tc>
@@ -2369,7 +3089,127 @@
                 <w:sz w:val="15"/>
                 <w:szCs w:val="15"/>
               </w:rPr>
-              <w:t xml:space="preserve">(Argilés et al., 2015; Fjaervoll et al., 2022; Hirota et al., 2013; Kamøy et al., 2022; Portello et al., 2013)</w:t>
+              <w:t xml:space="preserve">(Argilés </w:t>
+            </w:r>
+            <w:r>
+              <w:rPr>
+                <w:rFonts w:ascii="Times New Roman" w:cs="Times New Roman" w:eastAsia="Times New Roman" w:hAnsi="Times New Roman"/>
+                <w:b w:val="false"/>
+                <w:bCs w:val="false"/>
+                <w:i/>
+                <w:iCs/>
+                <w:sz w:val="15"/>
+                <w:szCs w:val="15"/>
+              </w:rPr>
+              <w:t xml:space="preserve">et al.</w:t>
+            </w:r>
+            <w:r>
+              <w:rPr>
+                <w:rFonts w:ascii="Times New Roman" w:cs="Times New Roman" w:eastAsia="Times New Roman" w:hAnsi="Times New Roman"/>
+                <w:b w:val="false"/>
+                <w:bCs w:val="false"/>
+                <w:i w:val="false"/>
+                <w:iCs w:val="false"/>
+                <w:sz w:val="15"/>
+                <w:szCs w:val="15"/>
+              </w:rPr>
+              <w:t xml:space="preserve">, 2015; Fjaervoll </w:t>
+            </w:r>
+            <w:r>
+              <w:rPr>
+                <w:rFonts w:ascii="Times New Roman" w:cs="Times New Roman" w:eastAsia="Times New Roman" w:hAnsi="Times New Roman"/>
+                <w:b w:val="false"/>
+                <w:bCs w:val="false"/>
+                <w:i/>
+                <w:iCs/>
+                <w:sz w:val="15"/>
+                <w:szCs w:val="15"/>
+              </w:rPr>
+              <w:t xml:space="preserve">et al.</w:t>
+            </w:r>
+            <w:r>
+              <w:rPr>
+                <w:rFonts w:ascii="Times New Roman" w:cs="Times New Roman" w:eastAsia="Times New Roman" w:hAnsi="Times New Roman"/>
+                <w:b w:val="false"/>
+                <w:bCs w:val="false"/>
+                <w:i w:val="false"/>
+                <w:iCs w:val="false"/>
+                <w:sz w:val="15"/>
+                <w:szCs w:val="15"/>
+              </w:rPr>
+              <w:t xml:space="preserve">, 2022; Hirota </w:t>
+            </w:r>
+            <w:r>
+              <w:rPr>
+                <w:rFonts w:ascii="Times New Roman" w:cs="Times New Roman" w:eastAsia="Times New Roman" w:hAnsi="Times New Roman"/>
+                <w:b w:val="false"/>
+                <w:bCs w:val="false"/>
+                <w:i/>
+                <w:iCs/>
+                <w:sz w:val="15"/>
+                <w:szCs w:val="15"/>
+              </w:rPr>
+              <w:t xml:space="preserve">et al.</w:t>
+            </w:r>
+            <w:r>
+              <w:rPr>
+                <w:rFonts w:ascii="Times New Roman" w:cs="Times New Roman" w:eastAsia="Times New Roman" w:hAnsi="Times New Roman"/>
+                <w:b w:val="false"/>
+                <w:bCs w:val="false"/>
+                <w:i w:val="false"/>
+                <w:iCs w:val="false"/>
+                <w:sz w:val="15"/>
+                <w:szCs w:val="15"/>
+              </w:rPr>
+              <w:t xml:space="preserve">, 2013; Kamøy </w:t>
+            </w:r>
+            <w:r>
+              <w:rPr>
+                <w:rFonts w:ascii="Times New Roman" w:cs="Times New Roman" w:eastAsia="Times New Roman" w:hAnsi="Times New Roman"/>
+                <w:b w:val="false"/>
+                <w:bCs w:val="false"/>
+                <w:i/>
+                <w:iCs/>
+                <w:sz w:val="15"/>
+                <w:szCs w:val="15"/>
+              </w:rPr>
+              <w:t xml:space="preserve">et al.</w:t>
+            </w:r>
+            <w:r>
+              <w:rPr>
+                <w:rFonts w:ascii="Times New Roman" w:cs="Times New Roman" w:eastAsia="Times New Roman" w:hAnsi="Times New Roman"/>
+                <w:b w:val="false"/>
+                <w:bCs w:val="false"/>
+                <w:i w:val="false"/>
+                <w:iCs w:val="false"/>
+                <w:sz w:val="15"/>
+                <w:szCs w:val="15"/>
+              </w:rPr>
+              <w:t xml:space="preserve">, 2022; Portello </w:t>
+            </w:r>
+            <w:r>
+              <w:rPr>
+                <w:rFonts w:ascii="Times New Roman" w:cs="Times New Roman" w:eastAsia="Times New Roman" w:hAnsi="Times New Roman"/>
+                <w:b w:val="false"/>
+                <w:bCs w:val="false"/>
+                <w:i/>
+                <w:iCs/>
+                <w:sz w:val="15"/>
+                <w:szCs w:val="15"/>
+              </w:rPr>
+              <w:t xml:space="preserve">et al.</w:t>
+            </w:r>
+            <w:r>
+              <w:rPr>
+                <w:rFonts w:ascii="Times New Roman" w:cs="Times New Roman" w:eastAsia="Times New Roman" w:hAnsi="Times New Roman"/>
+                <w:b w:val="false"/>
+                <w:bCs w:val="false"/>
+                <w:i w:val="false"/>
+                <w:iCs w:val="false"/>
+                <w:sz w:val="15"/>
+                <w:szCs w:val="15"/>
+              </w:rPr>
+              <w:t xml:space="preserve">, 2013)</w:t>
             </w:r>
           </w:p>
         </w:tc>
@@ -2567,7 +3407,79 @@
                 <w:sz w:val="15"/>
                 <w:szCs w:val="15"/>
               </w:rPr>
-              <w:t xml:space="preserve">(Abe et al., 2014; Abe, 2023; Jackson et al., 2016; Warm et al., 2008)</w:t>
+              <w:t xml:space="preserve">(Abe </w:t>
+            </w:r>
+            <w:r>
+              <w:rPr>
+                <w:rFonts w:ascii="Times New Roman" w:cs="Times New Roman" w:eastAsia="Times New Roman" w:hAnsi="Times New Roman"/>
+                <w:b w:val="false"/>
+                <w:bCs w:val="false"/>
+                <w:i/>
+                <w:iCs/>
+                <w:sz w:val="15"/>
+                <w:szCs w:val="15"/>
+              </w:rPr>
+              <w:t xml:space="preserve">et al.</w:t>
+            </w:r>
+            <w:r>
+              <w:rPr>
+                <w:rFonts w:ascii="Times New Roman" w:cs="Times New Roman" w:eastAsia="Times New Roman" w:hAnsi="Times New Roman"/>
+                <w:b w:val="false"/>
+                <w:bCs w:val="false"/>
+                <w:i w:val="false"/>
+                <w:iCs w:val="false"/>
+                <w:sz w:val="15"/>
+                <w:szCs w:val="15"/>
+              </w:rPr>
+              <w:t xml:space="preserve">, 2014; Abe, 2023; Jackson </w:t>
+            </w:r>
+            <w:r>
+              <w:rPr>
+                <w:rFonts w:ascii="Times New Roman" w:cs="Times New Roman" w:eastAsia="Times New Roman" w:hAnsi="Times New Roman"/>
+                <w:b w:val="false"/>
+                <w:bCs w:val="false"/>
+                <w:i/>
+                <w:iCs/>
+                <w:sz w:val="15"/>
+                <w:szCs w:val="15"/>
+              </w:rPr>
+              <w:t xml:space="preserve">et al.</w:t>
+            </w:r>
+            <w:r>
+              <w:rPr>
+                <w:rFonts w:ascii="Times New Roman" w:cs="Times New Roman" w:eastAsia="Times New Roman" w:hAnsi="Times New Roman"/>
+                <w:b w:val="false"/>
+                <w:bCs w:val="false"/>
+                <w:i w:val="false"/>
+                <w:iCs w:val="false"/>
+                <w:sz w:val="15"/>
+                <w:szCs w:val="15"/>
+              </w:rPr>
+              <w:t xml:space="preserve">, 2016; Warm </w:t>
+            </w:r>
+            <w:r>
+              <w:rPr>
+                <w:rFonts w:ascii="Times New Roman" w:cs="Times New Roman" w:eastAsia="Times New Roman" w:hAnsi="Times New Roman"/>
+                <w:b w:val="false"/>
+                <w:bCs w:val="false"/>
+                <w:i/>
+                <w:iCs/>
+                <w:sz w:val="15"/>
+                <w:szCs w:val="15"/>
+              </w:rPr>
+              <w:t xml:space="preserve">et al.</w:t>
+            </w:r>
+            <w:r>
+              <w:rPr>
+                <w:rFonts w:ascii="Times New Roman" w:cs="Times New Roman" w:eastAsia="Times New Roman" w:hAnsi="Times New Roman"/>
+                <w:b w:val="false"/>
+                <w:bCs w:val="false"/>
+                <w:i w:val="false"/>
+                <w:iCs w:val="false"/>
+                <w:sz w:val="15"/>
+                <w:szCs w:val="15"/>
+              </w:rPr>
+              <w:t xml:space="preserve">, 2008)</w:t>
             </w:r>
           </w:p>
         </w:tc>
@@ -2656,7 +3568,151 @@
           <w:sz w:val="24"/>
           <w:szCs w:val="24"/>
         </w:rPr>
-        <w:t xml:space="preserve">The pooled prevalence of 69.0 per cent across 103 studies conceals heterogeneity attributable partly to inconsistent case definition (Ccami-Bernal et al., 2024). One finding carries methodological force: prevalence was higher in studies that did not use the Computer Vision Syndrome Questionnaire (75.4 per cent), and meta-regression associated use of that instrument with lower estimates (Ccami-Bernal et al., 2024), so ad hoc checklists appear to inflate prevalence and a validated instrument with a defined cut-off is preferable. Reviews identify exposure beyond four to five hours daily, uncorrected refractive error, accommodative and vergence anomalies, altered blinking, close working distance, small font size, adverse lighting and contact-lens wear as risk factors (Ccami-Bernal et al., 2024; Mataftsi et al., 2023; Pucker et al., 2024; Sheppard &amp; Wolffsohn, 2018), and note that preventive measures acting at different points of the dry-eye cycle may be complementary (Kamøy et al., 2022).</w:t>
+        <w:t xml:space="preserve">The pooled prevalence of 69.0 per cent across 103 studies conceals heterogeneity attributable partly to inconsistent case definition (Ccami-Bernal </w:t>
+      </w:r>
+      <w:r>
+        <w:rPr>
+          <w:rFonts w:ascii="Times New Roman" w:cs="Times New Roman" w:eastAsia="Times New Roman" w:hAnsi="Times New Roman"/>
+          <w:b w:val="false"/>
+          <w:bCs w:val="false"/>
+          <w:i/>
+          <w:iCs/>
+          <w:sz w:val="24"/>
+          <w:szCs w:val="24"/>
+        </w:rPr>
+        <w:t xml:space="preserve">et al.</w:t>
+      </w:r>
+      <w:r>
+        <w:rPr>
+          <w:rFonts w:ascii="Times New Roman" w:cs="Times New Roman" w:eastAsia="Times New Roman" w:hAnsi="Times New Roman"/>
+          <w:b w:val="false"/>
+          <w:bCs w:val="false"/>
+          <w:i w:val="false"/>
+          <w:iCs w:val="false"/>
+          <w:sz w:val="24"/>
+          <w:szCs w:val="24"/>
+        </w:rPr>
+        <w:t xml:space="preserve">, 2024). One finding carries methodological force: prevalence was higher in studies that did not use the Computer Vision Syndrome Questionnaire (75.4 per cent), and meta-regression associated use of that instrument with lower estimates (Ccami-Bernal </w:t>
+      </w:r>
+      <w:r>
+        <w:rPr>
+          <w:rFonts w:ascii="Times New Roman" w:cs="Times New Roman" w:eastAsia="Times New Roman" w:hAnsi="Times New Roman"/>
+          <w:b w:val="false"/>
+          <w:bCs w:val="false"/>
+          <w:i/>
+          <w:iCs/>
+          <w:sz w:val="24"/>
+          <w:szCs w:val="24"/>
+        </w:rPr>
+        <w:t xml:space="preserve">et al.</w:t>
+      </w:r>
+      <w:r>
+        <w:rPr>
+          <w:rFonts w:ascii="Times New Roman" w:cs="Times New Roman" w:eastAsia="Times New Roman" w:hAnsi="Times New Roman"/>
+          <w:b w:val="false"/>
+          <w:bCs w:val="false"/>
+          <w:i w:val="false"/>
+          <w:iCs w:val="false"/>
+          <w:sz w:val="24"/>
+          <w:szCs w:val="24"/>
+        </w:rPr>
+        <w:t xml:space="preserve">, 2024), so ad hoc checklists appear to inflate prevalence and a validated instrument with a defined cut-off is preferable. Reviews identify exposure beyond four to five hours daily, uncorrected refractive error, accommodative and vergence anomalies, altered blinking, close working distance, small font size, adverse lighting and contact-lens wear as risk factors (Ccami-Bernal </w:t>
+      </w:r>
+      <w:r>
+        <w:rPr>
+          <w:rFonts w:ascii="Times New Roman" w:cs="Times New Roman" w:eastAsia="Times New Roman" w:hAnsi="Times New Roman"/>
+          <w:b w:val="false"/>
+          <w:bCs w:val="false"/>
+          <w:i/>
+          <w:iCs/>
+          <w:sz w:val="24"/>
+          <w:szCs w:val="24"/>
+        </w:rPr>
+        <w:t xml:space="preserve">et al.</w:t>
+      </w:r>
+      <w:r>
+        <w:rPr>
+          <w:rFonts w:ascii="Times New Roman" w:cs="Times New Roman" w:eastAsia="Times New Roman" w:hAnsi="Times New Roman"/>
+          <w:b w:val="false"/>
+          <w:bCs w:val="false"/>
+          <w:i w:val="false"/>
+          <w:iCs w:val="false"/>
+          <w:sz w:val="24"/>
+          <w:szCs w:val="24"/>
+        </w:rPr>
+        <w:t xml:space="preserve">, 2024; Mataftsi </w:t>
+      </w:r>
+      <w:r>
+        <w:rPr>
+          <w:rFonts w:ascii="Times New Roman" w:cs="Times New Roman" w:eastAsia="Times New Roman" w:hAnsi="Times New Roman"/>
+          <w:b w:val="false"/>
+          <w:bCs w:val="false"/>
+          <w:i/>
+          <w:iCs/>
+          <w:sz w:val="24"/>
+          <w:szCs w:val="24"/>
+        </w:rPr>
+        <w:t xml:space="preserve">et al.</w:t>
+      </w:r>
+      <w:r>
+        <w:rPr>
+          <w:rFonts w:ascii="Times New Roman" w:cs="Times New Roman" w:eastAsia="Times New Roman" w:hAnsi="Times New Roman"/>
+          <w:b w:val="false"/>
+          <w:bCs w:val="false"/>
+          <w:i w:val="false"/>
+          <w:iCs w:val="false"/>
+          <w:sz w:val="24"/>
+          <w:szCs w:val="24"/>
+        </w:rPr>
+        <w:t xml:space="preserve">, 2023; Pucker </w:t>
+      </w:r>
+      <w:r>
+        <w:rPr>
+          <w:rFonts w:ascii="Times New Roman" w:cs="Times New Roman" w:eastAsia="Times New Roman" w:hAnsi="Times New Roman"/>
+          <w:b w:val="false"/>
+          <w:bCs w:val="false"/>
+          <w:i/>
+          <w:iCs/>
+          <w:sz w:val="24"/>
+          <w:szCs w:val="24"/>
+        </w:rPr>
+        <w:t xml:space="preserve">et al.</w:t>
+      </w:r>
+      <w:r>
+        <w:rPr>
+          <w:rFonts w:ascii="Times New Roman" w:cs="Times New Roman" w:eastAsia="Times New Roman" w:hAnsi="Times New Roman"/>
+          <w:b w:val="false"/>
+          <w:bCs w:val="false"/>
+          <w:i w:val="false"/>
+          <w:iCs w:val="false"/>
+          <w:sz w:val="24"/>
+          <w:szCs w:val="24"/>
+        </w:rPr>
+        <w:t xml:space="preserve">, 2024; Sheppard &amp; Wolffsohn, 2018), and note that preventive measures acting at different points of the dry-eye cycle may be complementary (Kamøy </w:t>
+      </w:r>
+      <w:r>
+        <w:rPr>
+          <w:rFonts w:ascii="Times New Roman" w:cs="Times New Roman" w:eastAsia="Times New Roman" w:hAnsi="Times New Roman"/>
+          <w:b w:val="false"/>
+          <w:bCs w:val="false"/>
+          <w:i/>
+          <w:iCs/>
+          <w:sz w:val="24"/>
+          <w:szCs w:val="24"/>
+        </w:rPr>
+        <w:t xml:space="preserve">et al.</w:t>
+      </w:r>
+      <w:r>
+        <w:rPr>
+          <w:rFonts w:ascii="Times New Roman" w:cs="Times New Roman" w:eastAsia="Times New Roman" w:hAnsi="Times New Roman"/>
+          <w:b w:val="false"/>
+          <w:bCs w:val="false"/>
+          <w:i w:val="false"/>
+          <w:iCs w:val="false"/>
+          <w:sz w:val="24"/>
+          <w:szCs w:val="24"/>
+        </w:rPr>
+        <w:t xml:space="preserve">, 2022).</w:t>
       </w:r>
     </w:p>
     <w:p>
@@ -3208,7 +4264,19 @@
                 <w:sz w:val="15"/>
                 <w:szCs w:val="15"/>
               </w:rPr>
-              <w:t xml:space="preserve">Piepenbrock et al.</w:t>
+              <w:t xml:space="preserve">Piepenbrock </w:t>
+            </w:r>
+            <w:r>
+              <w:rPr>
+                <w:rFonts w:ascii="Times New Roman" w:cs="Times New Roman" w:eastAsia="Times New Roman" w:hAnsi="Times New Roman"/>
+                <w:b w:val="false"/>
+                <w:bCs w:val="false"/>
+                <w:i/>
+                <w:iCs/>
+                <w:sz w:val="15"/>
+                <w:szCs w:val="15"/>
+              </w:rPr>
+              <w:t xml:space="preserve">et al.</w:t>
             </w:r>
           </w:p>
         </w:tc>
@@ -3406,7 +4474,19 @@
                 <w:sz w:val="15"/>
                 <w:szCs w:val="15"/>
               </w:rPr>
-              <w:t xml:space="preserve">Piepenbrock et al.</w:t>
+              <w:t xml:space="preserve">Piepenbrock </w:t>
+            </w:r>
+            <w:r>
+              <w:rPr>
+                <w:rFonts w:ascii="Times New Roman" w:cs="Times New Roman" w:eastAsia="Times New Roman" w:hAnsi="Times New Roman"/>
+                <w:b w:val="false"/>
+                <w:bCs w:val="false"/>
+                <w:i/>
+                <w:iCs/>
+                <w:sz w:val="15"/>
+                <w:szCs w:val="15"/>
+              </w:rPr>
+              <w:t xml:space="preserve">et al.</w:t>
             </w:r>
           </w:p>
         </w:tc>
@@ -3604,7 +4684,19 @@
                 <w:sz w:val="15"/>
                 <w:szCs w:val="15"/>
               </w:rPr>
-              <w:t xml:space="preserve">Dobres et al.</w:t>
+              <w:t xml:space="preserve">Dobres </w:t>
+            </w:r>
+            <w:r>
+              <w:rPr>
+                <w:rFonts w:ascii="Times New Roman" w:cs="Times New Roman" w:eastAsia="Times New Roman" w:hAnsi="Times New Roman"/>
+                <w:b w:val="false"/>
+                <w:bCs w:val="false"/>
+                <w:i/>
+                <w:iCs/>
+                <w:sz w:val="15"/>
+                <w:szCs w:val="15"/>
+              </w:rPr>
+              <w:t xml:space="preserve">et al.</w:t>
             </w:r>
           </w:p>
         </w:tc>
@@ -3802,7 +4894,19 @@
                 <w:sz w:val="15"/>
                 <w:szCs w:val="15"/>
               </w:rPr>
-              <w:t xml:space="preserve">Dobres et al.</w:t>
+              <w:t xml:space="preserve">Dobres </w:t>
+            </w:r>
+            <w:r>
+              <w:rPr>
+                <w:rFonts w:ascii="Times New Roman" w:cs="Times New Roman" w:eastAsia="Times New Roman" w:hAnsi="Times New Roman"/>
+                <w:b w:val="false"/>
+                <w:bCs w:val="false"/>
+                <w:i/>
+                <w:iCs/>
+                <w:sz w:val="15"/>
+                <w:szCs w:val="15"/>
+              </w:rPr>
+              <w:t xml:space="preserve">et al.</w:t>
             </w:r>
           </w:p>
         </w:tc>
@@ -4198,7 +5302,19 @@
                 <w:sz w:val="15"/>
                 <w:szCs w:val="15"/>
               </w:rPr>
-              <w:t xml:space="preserve">Lin et al.</w:t>
+              <w:t xml:space="preserve">Lin </w:t>
+            </w:r>
+            <w:r>
+              <w:rPr>
+                <w:rFonts w:ascii="Times New Roman" w:cs="Times New Roman" w:eastAsia="Times New Roman" w:hAnsi="Times New Roman"/>
+                <w:b w:val="false"/>
+                <w:bCs w:val="false"/>
+                <w:i/>
+                <w:iCs/>
+                <w:sz w:val="15"/>
+                <w:szCs w:val="15"/>
+              </w:rPr>
+              <w:t xml:space="preserve">et al.</w:t>
             </w:r>
           </w:p>
         </w:tc>
@@ -4912,7 +6028,19 @@
                 <w:sz w:val="15"/>
                 <w:szCs w:val="15"/>
               </w:rPr>
-              <w:t xml:space="preserve">Jiménez et al.</w:t>
+              <w:t xml:space="preserve">Jiménez </w:t>
+            </w:r>
+            <w:r>
+              <w:rPr>
+                <w:rFonts w:ascii="Times New Roman" w:cs="Times New Roman" w:eastAsia="Times New Roman" w:hAnsi="Times New Roman"/>
+                <w:b w:val="false"/>
+                <w:bCs w:val="false"/>
+                <w:i/>
+                <w:iCs/>
+                <w:sz w:val="15"/>
+                <w:szCs w:val="15"/>
+              </w:rPr>
+              <w:t xml:space="preserve">et al.</w:t>
             </w:r>
           </w:p>
         </w:tc>
@@ -5110,7 +6238,19 @@
                 <w:sz w:val="15"/>
                 <w:szCs w:val="15"/>
               </w:rPr>
-              <w:t xml:space="preserve">Xie et al.</w:t>
+              <w:t xml:space="preserve">Xie </w:t>
+            </w:r>
+            <w:r>
+              <w:rPr>
+                <w:rFonts w:ascii="Times New Roman" w:cs="Times New Roman" w:eastAsia="Times New Roman" w:hAnsi="Times New Roman"/>
+                <w:b w:val="false"/>
+                <w:bCs w:val="false"/>
+                <w:i/>
+                <w:iCs/>
+                <w:sz w:val="15"/>
+                <w:szCs w:val="15"/>
+              </w:rPr>
+              <w:t xml:space="preserve">et al.</w:t>
             </w:r>
           </w:p>
         </w:tc>
@@ -5308,7 +6448,19 @@
                 <w:sz w:val="15"/>
                 <w:szCs w:val="15"/>
               </w:rPr>
-              <w:t xml:space="preserve">Tian et al.</w:t>
+              <w:t xml:space="preserve">Tian </w:t>
+            </w:r>
+            <w:r>
+              <w:rPr>
+                <w:rFonts w:ascii="Times New Roman" w:cs="Times New Roman" w:eastAsia="Times New Roman" w:hAnsi="Times New Roman"/>
+                <w:b w:val="false"/>
+                <w:bCs w:val="false"/>
+                <w:i/>
+                <w:iCs/>
+                <w:sz w:val="15"/>
+                <w:szCs w:val="15"/>
+              </w:rPr>
+              <w:t xml:space="preserve">et al.</w:t>
             </w:r>
           </w:p>
         </w:tc>
@@ -5506,7 +6658,19 @@
                 <w:sz w:val="15"/>
                 <w:szCs w:val="15"/>
               </w:rPr>
-              <w:t xml:space="preserve">Fan et al.</w:t>
+              <w:t xml:space="preserve">Fan </w:t>
+            </w:r>
+            <w:r>
+              <w:rPr>
+                <w:rFonts w:ascii="Times New Roman" w:cs="Times New Roman" w:eastAsia="Times New Roman" w:hAnsi="Times New Roman"/>
+                <w:b w:val="false"/>
+                <w:bCs w:val="false"/>
+                <w:i/>
+                <w:iCs/>
+                <w:sz w:val="15"/>
+                <w:szCs w:val="15"/>
+              </w:rPr>
+              <w:t xml:space="preserve">et al.</w:t>
             </w:r>
           </w:p>
         </w:tc>
@@ -5680,7 +6844,55 @@
           <w:sz w:val="24"/>
           <w:szCs w:val="24"/>
         </w:rPr>
-        <w:t xml:space="preserve">Two limitations recur. Exposure is brief, so duration is a plausible moderator of the discrepancy between studies finding no effect on reading speed (Jiménez et al., 2020) and those finding effects on fatigue and performance (Fan et al., 2024) — which neither was designed to estimate. More consequentially, none separates hue from luminance contrast: chromatic pigments differ in relative luminance, so a fixed colour set rendered on light and dark fields produces unequal, polarity-asymmetric contrasts, making contrast an inseparable covarying property of any colour manipulation that must be modelled (Buchner &amp; Baumgartner, 2007). Xie and colleagues (2021) add a complication directly relevant here: their objective and subjective indices pointed in opposite directions, dark mode improving blink measures while light mode was preferred and rated less fatiguing.</w:t>
+        <w:t xml:space="preserve">Two limitations recur. Exposure is brief, so duration is a plausible moderator of the discrepancy between studies finding no effect on reading speed (Jiménez </w:t>
+      </w:r>
+      <w:r>
+        <w:rPr>
+          <w:rFonts w:ascii="Times New Roman" w:cs="Times New Roman" w:eastAsia="Times New Roman" w:hAnsi="Times New Roman"/>
+          <w:b w:val="false"/>
+          <w:bCs w:val="false"/>
+          <w:i/>
+          <w:iCs/>
+          <w:sz w:val="24"/>
+          <w:szCs w:val="24"/>
+        </w:rPr>
+        <w:t xml:space="preserve">et al.</w:t>
+      </w:r>
+      <w:r>
+        <w:rPr>
+          <w:rFonts w:ascii="Times New Roman" w:cs="Times New Roman" w:eastAsia="Times New Roman" w:hAnsi="Times New Roman"/>
+          <w:b w:val="false"/>
+          <w:bCs w:val="false"/>
+          <w:i w:val="false"/>
+          <w:iCs w:val="false"/>
+          <w:sz w:val="24"/>
+          <w:szCs w:val="24"/>
+        </w:rPr>
+        <w:t xml:space="preserve">, 2020) and those finding effects on fatigue and performance (Fan </w:t>
+      </w:r>
+      <w:r>
+        <w:rPr>
+          <w:rFonts w:ascii="Times New Roman" w:cs="Times New Roman" w:eastAsia="Times New Roman" w:hAnsi="Times New Roman"/>
+          <w:b w:val="false"/>
+          <w:bCs w:val="false"/>
+          <w:i/>
+          <w:iCs/>
+          <w:sz w:val="24"/>
+          <w:szCs w:val="24"/>
+        </w:rPr>
+        <w:t xml:space="preserve">et al.</w:t>
+      </w:r>
+      <w:r>
+        <w:rPr>
+          <w:rFonts w:ascii="Times New Roman" w:cs="Times New Roman" w:eastAsia="Times New Roman" w:hAnsi="Times New Roman"/>
+          <w:b w:val="false"/>
+          <w:bCs w:val="false"/>
+          <w:i w:val="false"/>
+          <w:iCs w:val="false"/>
+          <w:sz w:val="24"/>
+          <w:szCs w:val="24"/>
+        </w:rPr>
+        <w:t xml:space="preserve">, 2024) — which neither was designed to estimate. More consequentially, none separates hue from luminance contrast: chromatic pigments differ in relative luminance, so a fixed colour set rendered on light and dark fields produces unequal, polarity-asymmetric contrasts, making contrast an inseparable covarying property of any colour manipulation that must be modelled (Buchner &amp; Baumgartner, 2007). Xie and colleagues (2021) add a complication directly relevant here: their objective and subjective indices pointed in opposite directions, dark mode improving blink measures while light mode was preferred and rated less fatiguing.</w:t>
       </w:r>
     </w:p>
     <w:p>
@@ -5699,7 +6911,55 @@
           <w:sz w:val="24"/>
           <w:szCs w:val="24"/>
         </w:rPr>
-        <w:t xml:space="preserve">The choice of contrast metric is also consequential. The ratio defined in the accessibility guidelines is the de facto design standard (World Wide Web Consortium, 2023), but takes no account of text size, weight or polarity, and is held to overstate contrast for dark colour pairs, so nominally compliant light-on-dark combinations can be hard to read and can produce halation. A perceptual replacement incorporating polarity and typography is under development (Advanced Perceptual Contrast Algorithm, n.d.). That a polarity-blind criterion governs a domain in which polarity is among the strongest determinants of legibility (Buchner &amp; Baumgartner, 2007; Dobres et al., 2017; Piepenbrock et al., 2014a, 2014b) is a problem to which empirical work can contribute.</w:t>
+        <w:t xml:space="preserve">The choice of contrast metric is also consequential. The ratio defined in the accessibility guidelines is the de facto design standard (World Wide Web Consortium, 2023), but takes no account of text size, weight or polarity, and is held to overstate contrast for dark colour pairs, so nominally compliant light-on-dark combinations can be hard to read and can produce halation. A perceptual replacement incorporating polarity and typography is under development (Advanced Perceptual Contrast Algorithm, n.d.). That a polarity-blind criterion governs a domain in which polarity is among the strongest determinants of legibility (Buchner &amp; Baumgartner, 2007; Dobres </w:t>
+      </w:r>
+      <w:r>
+        <w:rPr>
+          <w:rFonts w:ascii="Times New Roman" w:cs="Times New Roman" w:eastAsia="Times New Roman" w:hAnsi="Times New Roman"/>
+          <w:b w:val="false"/>
+          <w:bCs w:val="false"/>
+          <w:i/>
+          <w:iCs/>
+          <w:sz w:val="24"/>
+          <w:szCs w:val="24"/>
+        </w:rPr>
+        <w:t xml:space="preserve">et al.</w:t>
+      </w:r>
+      <w:r>
+        <w:rPr>
+          <w:rFonts w:ascii="Times New Roman" w:cs="Times New Roman" w:eastAsia="Times New Roman" w:hAnsi="Times New Roman"/>
+          <w:b w:val="false"/>
+          <w:bCs w:val="false"/>
+          <w:i w:val="false"/>
+          <w:iCs w:val="false"/>
+          <w:sz w:val="24"/>
+          <w:szCs w:val="24"/>
+        </w:rPr>
+        <w:t xml:space="preserve">, 2017; Piepenbrock </w:t>
+      </w:r>
+      <w:r>
+        <w:rPr>
+          <w:rFonts w:ascii="Times New Roman" w:cs="Times New Roman" w:eastAsia="Times New Roman" w:hAnsi="Times New Roman"/>
+          <w:b w:val="false"/>
+          <w:bCs w:val="false"/>
+          <w:i/>
+          <w:iCs/>
+          <w:sz w:val="24"/>
+          <w:szCs w:val="24"/>
+        </w:rPr>
+        <w:t xml:space="preserve">et al.</w:t>
+      </w:r>
+      <w:r>
+        <w:rPr>
+          <w:rFonts w:ascii="Times New Roman" w:cs="Times New Roman" w:eastAsia="Times New Roman" w:hAnsi="Times New Roman"/>
+          <w:b w:val="false"/>
+          <w:bCs w:val="false"/>
+          <w:i w:val="false"/>
+          <w:iCs w:val="false"/>
+          <w:sz w:val="24"/>
+          <w:szCs w:val="24"/>
+        </w:rPr>
+        <w:t xml:space="preserve">, 2014a, 2014b) is a problem to which empirical work can contribute.</w:t>
       </w:r>
     </w:p>
     <w:p>
@@ -5737,7 +6997,55 @@
           <w:sz w:val="24"/>
           <w:szCs w:val="24"/>
         </w:rPr>
-        <w:t xml:space="preserve">Illumination modulates the legibility cost of negative polarity (Dobres et al., 2017) and the fatigue cost of coloured text under it (Fan et al., 2024), consistent with a pupil-mediated account in which room light and display polarity trade against one another (Table 2.3).</w:t>
+        <w:t xml:space="preserve">Illumination modulates the legibility cost of negative polarity (Dobres </w:t>
+      </w:r>
+      <w:r>
+        <w:rPr>
+          <w:rFonts w:ascii="Times New Roman" w:cs="Times New Roman" w:eastAsia="Times New Roman" w:hAnsi="Times New Roman"/>
+          <w:b w:val="false"/>
+          <w:bCs w:val="false"/>
+          <w:i/>
+          <w:iCs/>
+          <w:sz w:val="24"/>
+          <w:szCs w:val="24"/>
+        </w:rPr>
+        <w:t xml:space="preserve">et al.</w:t>
+      </w:r>
+      <w:r>
+        <w:rPr>
+          <w:rFonts w:ascii="Times New Roman" w:cs="Times New Roman" w:eastAsia="Times New Roman" w:hAnsi="Times New Roman"/>
+          <w:b w:val="false"/>
+          <w:bCs w:val="false"/>
+          <w:i w:val="false"/>
+          <w:iCs w:val="false"/>
+          <w:sz w:val="24"/>
+          <w:szCs w:val="24"/>
+        </w:rPr>
+        <w:t xml:space="preserve">, 2017) and the fatigue cost of coloured text under it (Fan </w:t>
+      </w:r>
+      <w:r>
+        <w:rPr>
+          <w:rFonts w:ascii="Times New Roman" w:cs="Times New Roman" w:eastAsia="Times New Roman" w:hAnsi="Times New Roman"/>
+          <w:b w:val="false"/>
+          <w:bCs w:val="false"/>
+          <w:i/>
+          <w:iCs/>
+          <w:sz w:val="24"/>
+          <w:szCs w:val="24"/>
+        </w:rPr>
+        <w:t xml:space="preserve">et al.</w:t>
+      </w:r>
+      <w:r>
+        <w:rPr>
+          <w:rFonts w:ascii="Times New Roman" w:cs="Times New Roman" w:eastAsia="Times New Roman" w:hAnsi="Times New Roman"/>
+          <w:b w:val="false"/>
+          <w:bCs w:val="false"/>
+          <w:i w:val="false"/>
+          <w:iCs w:val="false"/>
+          <w:sz w:val="24"/>
+          <w:szCs w:val="24"/>
+        </w:rPr>
+        <w:t xml:space="preserve">, 2024), consistent with a pupil-mediated account in which room light and display polarity trade against one another (Table 2.3).</w:t>
       </w:r>
     </w:p>
     <w:p>
@@ -6239,7 +7547,19 @@
                 <w:sz w:val="15"/>
                 <w:szCs w:val="15"/>
               </w:rPr>
-              <w:t xml:space="preserve">Dobres et al.</w:t>
+              <w:t xml:space="preserve">Dobres </w:t>
+            </w:r>
+            <w:r>
+              <w:rPr>
+                <w:rFonts w:ascii="Times New Roman" w:cs="Times New Roman" w:eastAsia="Times New Roman" w:hAnsi="Times New Roman"/>
+                <w:b w:val="false"/>
+                <w:bCs w:val="false"/>
+                <w:i/>
+                <w:iCs/>
+                <w:sz w:val="15"/>
+                <w:szCs w:val="15"/>
+              </w:rPr>
+              <w:t xml:space="preserve">et al.</w:t>
             </w:r>
           </w:p>
         </w:tc>
@@ -6437,7 +7757,19 @@
                 <w:sz w:val="15"/>
                 <w:szCs w:val="15"/>
               </w:rPr>
-              <w:t xml:space="preserve">Xie et al.</w:t>
+              <w:t xml:space="preserve">Xie </w:t>
+            </w:r>
+            <w:r>
+              <w:rPr>
+                <w:rFonts w:ascii="Times New Roman" w:cs="Times New Roman" w:eastAsia="Times New Roman" w:hAnsi="Times New Roman"/>
+                <w:b w:val="false"/>
+                <w:bCs w:val="false"/>
+                <w:i/>
+                <w:iCs/>
+                <w:sz w:val="15"/>
+                <w:szCs w:val="15"/>
+              </w:rPr>
+              <w:t xml:space="preserve">et al.</w:t>
             </w:r>
           </w:p>
         </w:tc>
@@ -6635,7 +7967,19 @@
                 <w:sz w:val="15"/>
                 <w:szCs w:val="15"/>
               </w:rPr>
-              <w:t xml:space="preserve">Tian et al.</w:t>
+              <w:t xml:space="preserve">Tian </w:t>
+            </w:r>
+            <w:r>
+              <w:rPr>
+                <w:rFonts w:ascii="Times New Roman" w:cs="Times New Roman" w:eastAsia="Times New Roman" w:hAnsi="Times New Roman"/>
+                <w:b w:val="false"/>
+                <w:bCs w:val="false"/>
+                <w:i/>
+                <w:iCs/>
+                <w:sz w:val="15"/>
+                <w:szCs w:val="15"/>
+              </w:rPr>
+              <w:t xml:space="preserve">et al.</w:t>
             </w:r>
           </w:p>
         </w:tc>
@@ -6833,7 +8177,19 @@
                 <w:sz w:val="15"/>
                 <w:szCs w:val="15"/>
               </w:rPr>
-              <w:t xml:space="preserve">Fan et al.</w:t>
+              <w:t xml:space="preserve">Fan </w:t>
+            </w:r>
+            <w:r>
+              <w:rPr>
+                <w:rFonts w:ascii="Times New Roman" w:cs="Times New Roman" w:eastAsia="Times New Roman" w:hAnsi="Times New Roman"/>
+                <w:b w:val="false"/>
+                <w:bCs w:val="false"/>
+                <w:i/>
+                <w:iCs/>
+                <w:sz w:val="15"/>
+                <w:szCs w:val="15"/>
+              </w:rPr>
+              <w:t xml:space="preserve">et al.</w:t>
             </w:r>
           </w:p>
         </w:tc>
@@ -7231,7 +8587,31 @@
           <w:sz w:val="24"/>
           <w:szCs w:val="24"/>
         </w:rPr>
-        <w:t xml:space="preserve">The evidence is not uniform: the proofreading advantage was independent of ambient lighting (Buchner &amp; Baumgartner, 2007) whereas threshold legibility showed a clear interaction (Dobres et al., 2017), suggesting a threshold-like rather than smoothly scaling relationship and requiring that illumination be measured rather than merely described. The most recent work is the most directly relevant, reading in a dark room from a bright screen having produced the greatest tear-film destabilisation and the largest blink changes, with incomplete blinking rising over time in every condition (</w:t>
+        <w:t xml:space="preserve">The evidence is not uniform: the proofreading advantage was independent of ambient lighting (Buchner &amp; Baumgartner, 2007) whereas threshold legibility showed a clear interaction (Dobres </w:t>
+      </w:r>
+      <w:r>
+        <w:rPr>
+          <w:rFonts w:ascii="Times New Roman" w:cs="Times New Roman" w:eastAsia="Times New Roman" w:hAnsi="Times New Roman"/>
+          <w:b w:val="false"/>
+          <w:bCs w:val="false"/>
+          <w:i/>
+          <w:iCs/>
+          <w:sz w:val="24"/>
+          <w:szCs w:val="24"/>
+        </w:rPr>
+        <w:t xml:space="preserve">et al.</w:t>
+      </w:r>
+      <w:r>
+        <w:rPr>
+          <w:rFonts w:ascii="Times New Roman" w:cs="Times New Roman" w:eastAsia="Times New Roman" w:hAnsi="Times New Roman"/>
+          <w:b w:val="false"/>
+          <w:bCs w:val="false"/>
+          <w:i w:val="false"/>
+          <w:iCs w:val="false"/>
+          <w:sz w:val="24"/>
+          <w:szCs w:val="24"/>
+        </w:rPr>
+        <w:t xml:space="preserve">, 2017), suggesting a threshold-like rather than smoothly scaling relationship and requiring that illumination be measured rather than merely described. The most recent work is the most directly relevant, reading in a dark room from a bright screen having produced the greatest tear-film destabilisation and the largest blink changes, with incomplete blinking rising over time in every condition (</w:t>
       </w:r>
       <w:r>
         <w:rPr>
@@ -7295,7 +8675,55 @@
           <w:sz w:val="24"/>
           <w:szCs w:val="24"/>
         </w:rPr>
-        <w:t xml:space="preserve">Suppression of spontaneous blinking during display use is among the most reproducible findings in the field (Fjaervoll et al., 2022; Kamøy et al., 2022; Sheppard &amp; Wolffsohn, 2018), and the proportion of blinks that fail to close fully has the strongest claim to specificity (Table 2.4).</w:t>
+        <w:t xml:space="preserve">Suppression of spontaneous blinking during display use is among the most reproducible findings in the field (Fjaervoll </w:t>
+      </w:r>
+      <w:r>
+        <w:rPr>
+          <w:rFonts w:ascii="Times New Roman" w:cs="Times New Roman" w:eastAsia="Times New Roman" w:hAnsi="Times New Roman"/>
+          <w:b w:val="false"/>
+          <w:bCs w:val="false"/>
+          <w:i/>
+          <w:iCs/>
+          <w:sz w:val="24"/>
+          <w:szCs w:val="24"/>
+        </w:rPr>
+        <w:t xml:space="preserve">et al.</w:t>
+      </w:r>
+      <w:r>
+        <w:rPr>
+          <w:rFonts w:ascii="Times New Roman" w:cs="Times New Roman" w:eastAsia="Times New Roman" w:hAnsi="Times New Roman"/>
+          <w:b w:val="false"/>
+          <w:bCs w:val="false"/>
+          <w:i w:val="false"/>
+          <w:iCs w:val="false"/>
+          <w:sz w:val="24"/>
+          <w:szCs w:val="24"/>
+        </w:rPr>
+        <w:t xml:space="preserve">, 2022; Kamøy </w:t>
+      </w:r>
+      <w:r>
+        <w:rPr>
+          <w:rFonts w:ascii="Times New Roman" w:cs="Times New Roman" w:eastAsia="Times New Roman" w:hAnsi="Times New Roman"/>
+          <w:b w:val="false"/>
+          <w:bCs w:val="false"/>
+          <w:i/>
+          <w:iCs/>
+          <w:sz w:val="24"/>
+          <w:szCs w:val="24"/>
+        </w:rPr>
+        <w:t xml:space="preserve">et al.</w:t>
+      </w:r>
+      <w:r>
+        <w:rPr>
+          <w:rFonts w:ascii="Times New Roman" w:cs="Times New Roman" w:eastAsia="Times New Roman" w:hAnsi="Times New Roman"/>
+          <w:b w:val="false"/>
+          <w:bCs w:val="false"/>
+          <w:i w:val="false"/>
+          <w:iCs w:val="false"/>
+          <w:sz w:val="24"/>
+          <w:szCs w:val="24"/>
+        </w:rPr>
+        <w:t xml:space="preserve">, 2022; Sheppard &amp; Wolffsohn, 2018), and the proportion of blinks that fail to close fully has the strongest claim to specificity (Table 2.4).</w:t>
       </w:r>
     </w:p>
     <w:p>
@@ -7599,7 +9027,19 @@
                 <w:sz w:val="15"/>
                 <w:szCs w:val="15"/>
               </w:rPr>
-              <w:t xml:space="preserve">Cardona et al.</w:t>
+              <w:t xml:space="preserve">Cardona </w:t>
+            </w:r>
+            <w:r>
+              <w:rPr>
+                <w:rFonts w:ascii="Times New Roman" w:cs="Times New Roman" w:eastAsia="Times New Roman" w:hAnsi="Times New Roman"/>
+                <w:b w:val="false"/>
+                <w:bCs w:val="false"/>
+                <w:i/>
+                <w:iCs/>
+                <w:sz w:val="15"/>
+                <w:szCs w:val="15"/>
+              </w:rPr>
+              <w:t xml:space="preserve">et al.</w:t>
             </w:r>
           </w:p>
         </w:tc>
@@ -7797,7 +9237,19 @@
                 <w:sz w:val="15"/>
                 <w:szCs w:val="15"/>
               </w:rPr>
-              <w:t xml:space="preserve">Portello et al.</w:t>
+              <w:t xml:space="preserve">Portello </w:t>
+            </w:r>
+            <w:r>
+              <w:rPr>
+                <w:rFonts w:ascii="Times New Roman" w:cs="Times New Roman" w:eastAsia="Times New Roman" w:hAnsi="Times New Roman"/>
+                <w:b w:val="false"/>
+                <w:bCs w:val="false"/>
+                <w:i/>
+                <w:iCs/>
+                <w:sz w:val="15"/>
+                <w:szCs w:val="15"/>
+              </w:rPr>
+              <w:t xml:space="preserve">et al.</w:t>
             </w:r>
           </w:p>
         </w:tc>
@@ -7995,7 +9447,19 @@
                 <w:sz w:val="15"/>
                 <w:szCs w:val="15"/>
               </w:rPr>
-              <w:t xml:space="preserve">Hirota et al.</w:t>
+              <w:t xml:space="preserve">Hirota </w:t>
+            </w:r>
+            <w:r>
+              <w:rPr>
+                <w:rFonts w:ascii="Times New Roman" w:cs="Times New Roman" w:eastAsia="Times New Roman" w:hAnsi="Times New Roman"/>
+                <w:b w:val="false"/>
+                <w:bCs w:val="false"/>
+                <w:i/>
+                <w:iCs/>
+                <w:sz w:val="15"/>
+                <w:szCs w:val="15"/>
+              </w:rPr>
+              <w:t xml:space="preserve">et al.</w:t>
             </w:r>
           </w:p>
         </w:tc>
@@ -8193,7 +9657,19 @@
                 <w:sz w:val="15"/>
                 <w:szCs w:val="15"/>
               </w:rPr>
-              <w:t xml:space="preserve">Argilés et al.</w:t>
+              <w:t xml:space="preserve">Argilés </w:t>
+            </w:r>
+            <w:r>
+              <w:rPr>
+                <w:rFonts w:ascii="Times New Roman" w:cs="Times New Roman" w:eastAsia="Times New Roman" w:hAnsi="Times New Roman"/>
+                <w:b w:val="false"/>
+                <w:bCs w:val="false"/>
+                <w:i/>
+                <w:iCs/>
+                <w:sz w:val="15"/>
+                <w:szCs w:val="15"/>
+              </w:rPr>
+              <w:t xml:space="preserve">et al.</w:t>
             </w:r>
           </w:p>
         </w:tc>
@@ -8391,7 +9867,19 @@
                 <w:sz w:val="15"/>
                 <w:szCs w:val="15"/>
               </w:rPr>
-              <w:t xml:space="preserve">Jackson et al.</w:t>
+              <w:t xml:space="preserve">Jackson </w:t>
+            </w:r>
+            <w:r>
+              <w:rPr>
+                <w:rFonts w:ascii="Times New Roman" w:cs="Times New Roman" w:eastAsia="Times New Roman" w:hAnsi="Times New Roman"/>
+                <w:b w:val="false"/>
+                <w:bCs w:val="false"/>
+                <w:i/>
+                <w:iCs/>
+                <w:sz w:val="15"/>
+                <w:szCs w:val="15"/>
+              </w:rPr>
+              <w:t xml:space="preserve">et al.</w:t>
             </w:r>
           </w:p>
         </w:tc>
@@ -8789,7 +10277,103 @@
           <w:sz w:val="24"/>
           <w:szCs w:val="24"/>
         </w:rPr>
-        <w:t xml:space="preserve">Three findings forbid reading blink rate as a simple fatigue index: it is suppressed by reading irrespective of medium (Argilés et al., 2015) and by task dynamism at matched cognitive load (Cardona et al., 2011); total rate can hold steady while the complete-to-incomplete composition shifts (Hirota et al., 2013); and raising blink rate experimentally changed no symptom score (Portello et al., 2013). The incomplete-blink ratio, referenced to a within-participant baseline, is therefore the better-justified primary marker. Every study in Table 2.4 relied on manual frame-by-frame coding or dedicated hardware, and none manipulated polarity or text colour — which is why the samples are eleven to fifty, and why an automated measure is worth validating.</w:t>
+        <w:t xml:space="preserve">Three findings forbid reading blink rate as a simple fatigue index: it is suppressed by reading irrespective of medium (Argilés </w:t>
+      </w:r>
+      <w:r>
+        <w:rPr>
+          <w:rFonts w:ascii="Times New Roman" w:cs="Times New Roman" w:eastAsia="Times New Roman" w:hAnsi="Times New Roman"/>
+          <w:b w:val="false"/>
+          <w:bCs w:val="false"/>
+          <w:i/>
+          <w:iCs/>
+          <w:sz w:val="24"/>
+          <w:szCs w:val="24"/>
+        </w:rPr>
+        <w:t xml:space="preserve">et al.</w:t>
+      </w:r>
+      <w:r>
+        <w:rPr>
+          <w:rFonts w:ascii="Times New Roman" w:cs="Times New Roman" w:eastAsia="Times New Roman" w:hAnsi="Times New Roman"/>
+          <w:b w:val="false"/>
+          <w:bCs w:val="false"/>
+          <w:i w:val="false"/>
+          <w:iCs w:val="false"/>
+          <w:sz w:val="24"/>
+          <w:szCs w:val="24"/>
+        </w:rPr>
+        <w:t xml:space="preserve">, 2015) and by task dynamism at matched cognitive load (Cardona </w:t>
+      </w:r>
+      <w:r>
+        <w:rPr>
+          <w:rFonts w:ascii="Times New Roman" w:cs="Times New Roman" w:eastAsia="Times New Roman" w:hAnsi="Times New Roman"/>
+          <w:b w:val="false"/>
+          <w:bCs w:val="false"/>
+          <w:i/>
+          <w:iCs/>
+          <w:sz w:val="24"/>
+          <w:szCs w:val="24"/>
+        </w:rPr>
+        <w:t xml:space="preserve">et al.</w:t>
+      </w:r>
+      <w:r>
+        <w:rPr>
+          <w:rFonts w:ascii="Times New Roman" w:cs="Times New Roman" w:eastAsia="Times New Roman" w:hAnsi="Times New Roman"/>
+          <w:b w:val="false"/>
+          <w:bCs w:val="false"/>
+          <w:i w:val="false"/>
+          <w:iCs w:val="false"/>
+          <w:sz w:val="24"/>
+          <w:szCs w:val="24"/>
+        </w:rPr>
+        <w:t xml:space="preserve">, 2011); total rate can hold steady while the complete-to-incomplete composition shifts (Hirota </w:t>
+      </w:r>
+      <w:r>
+        <w:rPr>
+          <w:rFonts w:ascii="Times New Roman" w:cs="Times New Roman" w:eastAsia="Times New Roman" w:hAnsi="Times New Roman"/>
+          <w:b w:val="false"/>
+          <w:bCs w:val="false"/>
+          <w:i/>
+          <w:iCs/>
+          <w:sz w:val="24"/>
+          <w:szCs w:val="24"/>
+        </w:rPr>
+        <w:t xml:space="preserve">et al.</w:t>
+      </w:r>
+      <w:r>
+        <w:rPr>
+          <w:rFonts w:ascii="Times New Roman" w:cs="Times New Roman" w:eastAsia="Times New Roman" w:hAnsi="Times New Roman"/>
+          <w:b w:val="false"/>
+          <w:bCs w:val="false"/>
+          <w:i w:val="false"/>
+          <w:iCs w:val="false"/>
+          <w:sz w:val="24"/>
+          <w:szCs w:val="24"/>
+        </w:rPr>
+        <w:t xml:space="preserve">, 2013); and raising blink rate experimentally changed no symptom score (Portello </w:t>
+      </w:r>
+      <w:r>
+        <w:rPr>
+          <w:rFonts w:ascii="Times New Roman" w:cs="Times New Roman" w:eastAsia="Times New Roman" w:hAnsi="Times New Roman"/>
+          <w:b w:val="false"/>
+          <w:bCs w:val="false"/>
+          <w:i/>
+          <w:iCs/>
+          <w:sz w:val="24"/>
+          <w:szCs w:val="24"/>
+        </w:rPr>
+        <w:t xml:space="preserve">et al.</w:t>
+      </w:r>
+      <w:r>
+        <w:rPr>
+          <w:rFonts w:ascii="Times New Roman" w:cs="Times New Roman" w:eastAsia="Times New Roman" w:hAnsi="Times New Roman"/>
+          <w:b w:val="false"/>
+          <w:bCs w:val="false"/>
+          <w:i w:val="false"/>
+          <w:iCs w:val="false"/>
+          <w:sz w:val="24"/>
+          <w:szCs w:val="24"/>
+        </w:rPr>
+        <w:t xml:space="preserve">, 2013). The incomplete-blink ratio, referenced to a within-participant baseline, is therefore the better-justified primary marker. Every study in Table 2.4 relied on manual frame-by-frame coding or dedicated hardware, and none manipulated polarity or text colour — which is why the samples are eleven to fifty, and why an automated measure is worth validating.</w:t>
       </w:r>
     </w:p>
     <w:p>
@@ -8808,7 +10392,31 @@
           <w:sz w:val="24"/>
           <w:szCs w:val="24"/>
         </w:rPr>
-        <w:t xml:space="preserve">PERCLOS, the proportion of time the eyes are more than 80 per cent closed, is among the most validated indices for passive drowsiness detection (Abe, 2023) and correlates with vigilance-performance variability after sleep deprivation (Jackson et al., 2016). Its documented insensitivity in moderate drowsiness (Abe, 2023) dictates its role here as a covariate for sleepiness rather than a measure of visual fatigue.</w:t>
+        <w:t xml:space="preserve">PERCLOS, the proportion of time the eyes are more than 80 per cent closed, is among the most validated indices for passive drowsiness detection (Abe, 2023) and correlates with vigilance-performance variability after sleep deprivation (Jackson </w:t>
+      </w:r>
+      <w:r>
+        <w:rPr>
+          <w:rFonts w:ascii="Times New Roman" w:cs="Times New Roman" w:eastAsia="Times New Roman" w:hAnsi="Times New Roman"/>
+          <w:b w:val="false"/>
+          <w:bCs w:val="false"/>
+          <w:i/>
+          <w:iCs/>
+          <w:sz w:val="24"/>
+          <w:szCs w:val="24"/>
+        </w:rPr>
+        <w:t xml:space="preserve">et al.</w:t>
+      </w:r>
+      <w:r>
+        <w:rPr>
+          <w:rFonts w:ascii="Times New Roman" w:cs="Times New Roman" w:eastAsia="Times New Roman" w:hAnsi="Times New Roman"/>
+          <w:b w:val="false"/>
+          <w:bCs w:val="false"/>
+          <w:i w:val="false"/>
+          <w:iCs w:val="false"/>
+          <w:sz w:val="24"/>
+          <w:szCs w:val="24"/>
+        </w:rPr>
+        <w:t xml:space="preserve">, 2016). Its documented insensitivity in moderate drowsiness (Abe, 2023) dictates its role here as a covariate for sleepiness rather than a measure of visual fatigue.</w:t>
       </w:r>
     </w:p>
     <w:p>
@@ -8846,7 +10454,79 @@
           <w:sz w:val="24"/>
           <w:szCs w:val="24"/>
         </w:rPr>
-        <w:t xml:space="preserve">Comparison of reading media reports an advantage for print over screen, moderated by genre and time pressure (Delgado et al., 2018). This constrains how comprehension should be measured, since genre, difficulty and pacing must be standardised, but does not bear on the hypothesis under test, because a within-screen design removes the medium confound. Prolonged monotonous tasks also produce a vigilance decrement best accounted for by resource depletion (Warm et al., 2008), with lapses and reaction-time variability its most fatigue-sensitive indices (Abe et al., 2014). Attentional and visual-fatigue outcomes therefore share time on task as a driver and must be measured together if they are to be distinguished.</w:t>
+        <w:t xml:space="preserve">Comparison of reading media reports an advantage for print over screen, moderated by genre and time pressure (Delgado </w:t>
+      </w:r>
+      <w:r>
+        <w:rPr>
+          <w:rFonts w:ascii="Times New Roman" w:cs="Times New Roman" w:eastAsia="Times New Roman" w:hAnsi="Times New Roman"/>
+          <w:b w:val="false"/>
+          <w:bCs w:val="false"/>
+          <w:i/>
+          <w:iCs/>
+          <w:sz w:val="24"/>
+          <w:szCs w:val="24"/>
+        </w:rPr>
+        <w:t xml:space="preserve">et al.</w:t>
+      </w:r>
+      <w:r>
+        <w:rPr>
+          <w:rFonts w:ascii="Times New Roman" w:cs="Times New Roman" w:eastAsia="Times New Roman" w:hAnsi="Times New Roman"/>
+          <w:b w:val="false"/>
+          <w:bCs w:val="false"/>
+          <w:i w:val="false"/>
+          <w:iCs w:val="false"/>
+          <w:sz w:val="24"/>
+          <w:szCs w:val="24"/>
+        </w:rPr>
+        <w:t xml:space="preserve">, 2018). This constrains how comprehension should be measured, since genre, difficulty and pacing must be standardised, but does not bear on the hypothesis under test, because a within-screen design removes the medium confound. Prolonged monotonous tasks also produce a vigilance decrement best accounted for by resource depletion (Warm </w:t>
+      </w:r>
+      <w:r>
+        <w:rPr>
+          <w:rFonts w:ascii="Times New Roman" w:cs="Times New Roman" w:eastAsia="Times New Roman" w:hAnsi="Times New Roman"/>
+          <w:b w:val="false"/>
+          <w:bCs w:val="false"/>
+          <w:i/>
+          <w:iCs/>
+          <w:sz w:val="24"/>
+          <w:szCs w:val="24"/>
+        </w:rPr>
+        <w:t xml:space="preserve">et al.</w:t>
+      </w:r>
+      <w:r>
+        <w:rPr>
+          <w:rFonts w:ascii="Times New Roman" w:cs="Times New Roman" w:eastAsia="Times New Roman" w:hAnsi="Times New Roman"/>
+          <w:b w:val="false"/>
+          <w:bCs w:val="false"/>
+          <w:i w:val="false"/>
+          <w:iCs w:val="false"/>
+          <w:sz w:val="24"/>
+          <w:szCs w:val="24"/>
+        </w:rPr>
+        <w:t xml:space="preserve">, 2008), with lapses and reaction-time variability its most fatigue-sensitive indices (Abe </w:t>
+      </w:r>
+      <w:r>
+        <w:rPr>
+          <w:rFonts w:ascii="Times New Roman" w:cs="Times New Roman" w:eastAsia="Times New Roman" w:hAnsi="Times New Roman"/>
+          <w:b w:val="false"/>
+          <w:bCs w:val="false"/>
+          <w:i/>
+          <w:iCs/>
+          <w:sz w:val="24"/>
+          <w:szCs w:val="24"/>
+        </w:rPr>
+        <w:t xml:space="preserve">et al.</w:t>
+      </w:r>
+      <w:r>
+        <w:rPr>
+          <w:rFonts w:ascii="Times New Roman" w:cs="Times New Roman" w:eastAsia="Times New Roman" w:hAnsi="Times New Roman"/>
+          <w:b w:val="false"/>
+          <w:bCs w:val="false"/>
+          <w:i w:val="false"/>
+          <w:iCs w:val="false"/>
+          <w:sz w:val="24"/>
+          <w:szCs w:val="24"/>
+        </w:rPr>
+        <w:t xml:space="preserve">, 2014). Attentional and visual-fatigue outcomes therefore share time on task as a driver and must be measured together if they are to be distinguished.</w:t>
       </w:r>
     </w:p>
     <w:p>
@@ -8884,7 +10564,55 @@
           <w:sz w:val="24"/>
           <w:szCs w:val="24"/>
         </w:rPr>
-        <w:t xml:space="preserve">The Computer Vision Syndrome Questionnaire assesses frequency and intensity of sixteen symptoms on a Rasch-fitting scale, with sensitivity and specificity above 70 per cent and test–retest intraclass correlation of 0.802 (Seguí et al., 2015). Cross-cultural validation reports internal consistency of 0.793, sensitivity 78.5 per cent, specificity 70.7 per cent, convergent validity with the Ocular Surface Disease Index of 0.728 and a cut-off of seven (Cantó-Sancho et al., 2024). Cognitive workload is conventionally indexed by the NASA Task Load Index across six dimensions (Hart &amp; Staveland, 1988). Review notes that correlations between objective and subjective measures are not always apparent (Sheppard &amp; Wolffsohn, 2018), a discrepancy treated here as an object of study.</w:t>
+        <w:t xml:space="preserve">The Computer Vision Syndrome Questionnaire assesses frequency and intensity of sixteen symptoms on a Rasch-fitting scale, with sensitivity and specificity above 70 per cent and test–retest intraclass correlation of 0.802 (Seguí </w:t>
+      </w:r>
+      <w:r>
+        <w:rPr>
+          <w:rFonts w:ascii="Times New Roman" w:cs="Times New Roman" w:eastAsia="Times New Roman" w:hAnsi="Times New Roman"/>
+          <w:b w:val="false"/>
+          <w:bCs w:val="false"/>
+          <w:i/>
+          <w:iCs/>
+          <w:sz w:val="24"/>
+          <w:szCs w:val="24"/>
+        </w:rPr>
+        <w:t xml:space="preserve">et al.</w:t>
+      </w:r>
+      <w:r>
+        <w:rPr>
+          <w:rFonts w:ascii="Times New Roman" w:cs="Times New Roman" w:eastAsia="Times New Roman" w:hAnsi="Times New Roman"/>
+          <w:b w:val="false"/>
+          <w:bCs w:val="false"/>
+          <w:i w:val="false"/>
+          <w:iCs w:val="false"/>
+          <w:sz w:val="24"/>
+          <w:szCs w:val="24"/>
+        </w:rPr>
+        <w:t xml:space="preserve">, 2015). Cross-cultural validation reports internal consistency of 0.793, sensitivity 78.5 per cent, specificity 70.7 per cent, convergent validity with the Ocular Surface Disease Index of 0.728 and a cut-off of seven (Cantó-Sancho </w:t>
+      </w:r>
+      <w:r>
+        <w:rPr>
+          <w:rFonts w:ascii="Times New Roman" w:cs="Times New Roman" w:eastAsia="Times New Roman" w:hAnsi="Times New Roman"/>
+          <w:b w:val="false"/>
+          <w:bCs w:val="false"/>
+          <w:i/>
+          <w:iCs/>
+          <w:sz w:val="24"/>
+          <w:szCs w:val="24"/>
+        </w:rPr>
+        <w:t xml:space="preserve">et al.</w:t>
+      </w:r>
+      <w:r>
+        <w:rPr>
+          <w:rFonts w:ascii="Times New Roman" w:cs="Times New Roman" w:eastAsia="Times New Roman" w:hAnsi="Times New Roman"/>
+          <w:b w:val="false"/>
+          <w:bCs w:val="false"/>
+          <w:i w:val="false"/>
+          <w:iCs w:val="false"/>
+          <w:sz w:val="24"/>
+          <w:szCs w:val="24"/>
+        </w:rPr>
+        <w:t xml:space="preserve">, 2024). Cognitive workload is conventionally indexed by the NASA Task Load Index across six dimensions (Hart &amp; Staveland, 1988). Review notes that correlations between objective and subjective measures are not always apparent (Sheppard &amp; Wolffsohn, 2018), a discrepancy treated here as an object of study.</w:t>
       </w:r>
     </w:p>
     <w:p>
@@ -8903,7 +10631,79 @@
           <w:sz w:val="24"/>
           <w:szCs w:val="24"/>
         </w:rPr>
-        <w:t xml:space="preserve">Automated blink detection derives a scalar eye aspect ratio from facial landmarks and identifies blinks as a temporal pattern in that signal (Soukupová &amp; Čech, 2016). Being continuous and normalised, it can distinguish partial from complete closure, automating what the clinical literature has done by hand (Argilés et al., 2015; Hirota et al., 2013; Portello et al., 2013). Validity differs by target: camera-based gaze estimation is lower in accuracy and sampling rate than infrared tracking and is defensible only for coarse zone classification, whereas blink measures are proportion-based and need temporal rather than spatial precision. Since blinks last 100 to 400 ms, duration-based metrics become unreliable below about 25 frames per second, while proportion measures are more robust. No published study has validated a camera-based incomplete-blink measure against manual annotation.</w:t>
+        <w:t xml:space="preserve">Automated blink detection derives a scalar eye aspect ratio from facial landmarks and identifies blinks as a temporal pattern in that signal (Soukupová &amp; Čech, 2016). Being continuous and normalised, it can distinguish partial from complete closure, automating what the clinical literature has done by hand (Argilés </w:t>
+      </w:r>
+      <w:r>
+        <w:rPr>
+          <w:rFonts w:ascii="Times New Roman" w:cs="Times New Roman" w:eastAsia="Times New Roman" w:hAnsi="Times New Roman"/>
+          <w:b w:val="false"/>
+          <w:bCs w:val="false"/>
+          <w:i/>
+          <w:iCs/>
+          <w:sz w:val="24"/>
+          <w:szCs w:val="24"/>
+        </w:rPr>
+        <w:t xml:space="preserve">et al.</w:t>
+      </w:r>
+      <w:r>
+        <w:rPr>
+          <w:rFonts w:ascii="Times New Roman" w:cs="Times New Roman" w:eastAsia="Times New Roman" w:hAnsi="Times New Roman"/>
+          <w:b w:val="false"/>
+          <w:bCs w:val="false"/>
+          <w:i w:val="false"/>
+          <w:iCs w:val="false"/>
+          <w:sz w:val="24"/>
+          <w:szCs w:val="24"/>
+        </w:rPr>
+        <w:t xml:space="preserve">, 2015; Hirota </w:t>
+      </w:r>
+      <w:r>
+        <w:rPr>
+          <w:rFonts w:ascii="Times New Roman" w:cs="Times New Roman" w:eastAsia="Times New Roman" w:hAnsi="Times New Roman"/>
+          <w:b w:val="false"/>
+          <w:bCs w:val="false"/>
+          <w:i/>
+          <w:iCs/>
+          <w:sz w:val="24"/>
+          <w:szCs w:val="24"/>
+        </w:rPr>
+        <w:t xml:space="preserve">et al.</w:t>
+      </w:r>
+      <w:r>
+        <w:rPr>
+          <w:rFonts w:ascii="Times New Roman" w:cs="Times New Roman" w:eastAsia="Times New Roman" w:hAnsi="Times New Roman"/>
+          <w:b w:val="false"/>
+          <w:bCs w:val="false"/>
+          <w:i w:val="false"/>
+          <w:iCs w:val="false"/>
+          <w:sz w:val="24"/>
+          <w:szCs w:val="24"/>
+        </w:rPr>
+        <w:t xml:space="preserve">, 2013; Portello </w:t>
+      </w:r>
+      <w:r>
+        <w:rPr>
+          <w:rFonts w:ascii="Times New Roman" w:cs="Times New Roman" w:eastAsia="Times New Roman" w:hAnsi="Times New Roman"/>
+          <w:b w:val="false"/>
+          <w:bCs w:val="false"/>
+          <w:i/>
+          <w:iCs/>
+          <w:sz w:val="24"/>
+          <w:szCs w:val="24"/>
+        </w:rPr>
+        <w:t xml:space="preserve">et al.</w:t>
+      </w:r>
+      <w:r>
+        <w:rPr>
+          <w:rFonts w:ascii="Times New Roman" w:cs="Times New Roman" w:eastAsia="Times New Roman" w:hAnsi="Times New Roman"/>
+          <w:b w:val="false"/>
+          <w:bCs w:val="false"/>
+          <w:i w:val="false"/>
+          <w:iCs w:val="false"/>
+          <w:sz w:val="24"/>
+          <w:szCs w:val="24"/>
+        </w:rPr>
+        <w:t xml:space="preserve">, 2013). Validity differs by target: camera-based gaze estimation is lower in accuracy and sampling rate than infrared tracking and is defensible only for coarse zone classification, whereas blink measures are proportion-based and need temporal rather than spatial precision. Since blinks last 100 to 400 ms, duration-based metrics become unreliable below about 25 frames per second, while proportion measures are more robust. No published study has validated a camera-based incomplete-blink measure against manual annotation.</w:t>
       </w:r>
     </w:p>
     <w:p>
@@ -9011,7 +10811,79 @@
           <w:sz w:val="24"/>
           <w:szCs w:val="24"/>
         </w:rPr>
-        <w:t xml:space="preserve">The interaction between polarity and text colour on visual fatigue appears unestimated, the only located text-colour fatigue study having held polarity constant (Fan et al., 2024); nor has hue been separated from luminance contrast in the studies located (Buchner &amp; Baumgartner, 2007; Jiménez et al., 2020; Xie et al., 2021).</w:t>
+        <w:t xml:space="preserve">The interaction between polarity and text colour on visual fatigue appears unestimated, the only located text-colour fatigue study having held polarity constant (Fan </w:t>
+      </w:r>
+      <w:r>
+        <w:rPr>
+          <w:rFonts w:ascii="Times New Roman" w:cs="Times New Roman" w:eastAsia="Times New Roman" w:hAnsi="Times New Roman"/>
+          <w:b w:val="false"/>
+          <w:bCs w:val="false"/>
+          <w:i/>
+          <w:iCs/>
+          <w:sz w:val="24"/>
+          <w:szCs w:val="24"/>
+        </w:rPr>
+        <w:t xml:space="preserve">et al.</w:t>
+      </w:r>
+      <w:r>
+        <w:rPr>
+          <w:rFonts w:ascii="Times New Roman" w:cs="Times New Roman" w:eastAsia="Times New Roman" w:hAnsi="Times New Roman"/>
+          <w:b w:val="false"/>
+          <w:bCs w:val="false"/>
+          <w:i w:val="false"/>
+          <w:iCs w:val="false"/>
+          <w:sz w:val="24"/>
+          <w:szCs w:val="24"/>
+        </w:rPr>
+        <w:t xml:space="preserve">, 2024); nor has hue been separated from luminance contrast in the studies located (Buchner &amp; Baumgartner, 2007; Jiménez </w:t>
+      </w:r>
+      <w:r>
+        <w:rPr>
+          <w:rFonts w:ascii="Times New Roman" w:cs="Times New Roman" w:eastAsia="Times New Roman" w:hAnsi="Times New Roman"/>
+          <w:b w:val="false"/>
+          <w:bCs w:val="false"/>
+          <w:i/>
+          <w:iCs/>
+          <w:sz w:val="24"/>
+          <w:szCs w:val="24"/>
+        </w:rPr>
+        <w:t xml:space="preserve">et al.</w:t>
+      </w:r>
+      <w:r>
+        <w:rPr>
+          <w:rFonts w:ascii="Times New Roman" w:cs="Times New Roman" w:eastAsia="Times New Roman" w:hAnsi="Times New Roman"/>
+          <w:b w:val="false"/>
+          <w:bCs w:val="false"/>
+          <w:i w:val="false"/>
+          <w:iCs w:val="false"/>
+          <w:sz w:val="24"/>
+          <w:szCs w:val="24"/>
+        </w:rPr>
+        <w:t xml:space="preserve">, 2020; Xie </w:t>
+      </w:r>
+      <w:r>
+        <w:rPr>
+          <w:rFonts w:ascii="Times New Roman" w:cs="Times New Roman" w:eastAsia="Times New Roman" w:hAnsi="Times New Roman"/>
+          <w:b w:val="false"/>
+          <w:bCs w:val="false"/>
+          <w:i/>
+          <w:iCs/>
+          <w:sz w:val="24"/>
+          <w:szCs w:val="24"/>
+        </w:rPr>
+        <w:t xml:space="preserve">et al.</w:t>
+      </w:r>
+      <w:r>
+        <w:rPr>
+          <w:rFonts w:ascii="Times New Roman" w:cs="Times New Roman" w:eastAsia="Times New Roman" w:hAnsi="Times New Roman"/>
+          <w:b w:val="false"/>
+          <w:bCs w:val="false"/>
+          <w:i w:val="false"/>
+          <w:iCs w:val="false"/>
+          <w:sz w:val="24"/>
+          <w:szCs w:val="24"/>
+        </w:rPr>
+        <w:t xml:space="preserve">, 2021).</w:t>
       </w:r>
     </w:p>
     <w:p>
@@ -9046,7 +10918,55 @@
           <w:sz w:val="24"/>
           <w:szCs w:val="24"/>
         </w:rPr>
-        <w:t xml:space="preserve">No located study reports contrast metrics alongside measured display photometry, the prevailing standard is polarity-blind (Advanced Perceptual Contrast Algorithm, n.d.; World Wide Web Consortium, 2023), and three-way effects of polarity, colour and illumination remain uncharacterised, the two-way findings being in partial conflict (Dobres et al., 2017; Fan et al., 2024).</w:t>
+        <w:t xml:space="preserve">No located study reports contrast metrics alongside measured display photometry, the prevailing standard is polarity-blind (Advanced Perceptual Contrast Algorithm, n.d.; World Wide Web Consortium, 2023), and three-way effects of polarity, colour and illumination remain uncharacterised, the two-way findings being in partial conflict (Dobres </w:t>
+      </w:r>
+      <w:r>
+        <w:rPr>
+          <w:rFonts w:ascii="Times New Roman" w:cs="Times New Roman" w:eastAsia="Times New Roman" w:hAnsi="Times New Roman"/>
+          <w:b w:val="false"/>
+          <w:bCs w:val="false"/>
+          <w:i/>
+          <w:iCs/>
+          <w:sz w:val="24"/>
+          <w:szCs w:val="24"/>
+        </w:rPr>
+        <w:t xml:space="preserve">et al.</w:t>
+      </w:r>
+      <w:r>
+        <w:rPr>
+          <w:rFonts w:ascii="Times New Roman" w:cs="Times New Roman" w:eastAsia="Times New Roman" w:hAnsi="Times New Roman"/>
+          <w:b w:val="false"/>
+          <w:bCs w:val="false"/>
+          <w:i w:val="false"/>
+          <w:iCs w:val="false"/>
+          <w:sz w:val="24"/>
+          <w:szCs w:val="24"/>
+        </w:rPr>
+        <w:t xml:space="preserve">, 2017; Fan </w:t>
+      </w:r>
+      <w:r>
+        <w:rPr>
+          <w:rFonts w:ascii="Times New Roman" w:cs="Times New Roman" w:eastAsia="Times New Roman" w:hAnsi="Times New Roman"/>
+          <w:b w:val="false"/>
+          <w:bCs w:val="false"/>
+          <w:i/>
+          <w:iCs/>
+          <w:sz w:val="24"/>
+          <w:szCs w:val="24"/>
+        </w:rPr>
+        <w:t xml:space="preserve">et al.</w:t>
+      </w:r>
+      <w:r>
+        <w:rPr>
+          <w:rFonts w:ascii="Times New Roman" w:cs="Times New Roman" w:eastAsia="Times New Roman" w:hAnsi="Times New Roman"/>
+          <w:b w:val="false"/>
+          <w:bCs w:val="false"/>
+          <w:i w:val="false"/>
+          <w:iCs w:val="false"/>
+          <w:sz w:val="24"/>
+          <w:szCs w:val="24"/>
+        </w:rPr>
+        <w:t xml:space="preserve">, 2024).</w:t>
       </w:r>
     </w:p>
     <w:p>
@@ -9081,7 +11001,31 @@
           <w:sz w:val="24"/>
           <w:szCs w:val="24"/>
         </w:rPr>
-        <w:t xml:space="preserve">Few studies co-register a validated symptom instrument with objective markers in the same condition, leaving the subjective–objective discrepancy unresolved (Sheppard &amp; Wolffsohn, 2018); where both were measured they pointed in opposite directions (Xie et al., 2021).</w:t>
+        <w:t xml:space="preserve">Few studies co-register a validated symptom instrument with objective markers in the same condition, leaving the subjective–objective discrepancy unresolved (Sheppard &amp; Wolffsohn, 2018); where both were measured they pointed in opposite directions (Xie </w:t>
+      </w:r>
+      <w:r>
+        <w:rPr>
+          <w:rFonts w:ascii="Times New Roman" w:cs="Times New Roman" w:eastAsia="Times New Roman" w:hAnsi="Times New Roman"/>
+          <w:b w:val="false"/>
+          <w:bCs w:val="false"/>
+          <w:i/>
+          <w:iCs/>
+          <w:sz w:val="24"/>
+          <w:szCs w:val="24"/>
+        </w:rPr>
+        <w:t xml:space="preserve">et al.</w:t>
+      </w:r>
+      <w:r>
+        <w:rPr>
+          <w:rFonts w:ascii="Times New Roman" w:cs="Times New Roman" w:eastAsia="Times New Roman" w:hAnsi="Times New Roman"/>
+          <w:b w:val="false"/>
+          <w:bCs w:val="false"/>
+          <w:i w:val="false"/>
+          <w:iCs w:val="false"/>
+          <w:sz w:val="24"/>
+          <w:szCs w:val="24"/>
+        </w:rPr>
+        <w:t xml:space="preserve">, 2021).</w:t>
       </w:r>
     </w:p>
     <w:p>
@@ -9142,7 +11086,79 @@
           <w:sz w:val="24"/>
           <w:szCs w:val="24"/>
         </w:rPr>
-        <w:t xml:space="preserve">, 2025; Argilés et al., 2015; Hirota et al., 2013; Portello et al., 2013), and no automated implementation has been validated against manual annotation in the literature located, so the measure does not scale.</w:t>
+        <w:t xml:space="preserve">, 2025; Argilés </w:t>
+      </w:r>
+      <w:r>
+        <w:rPr>
+          <w:rFonts w:ascii="Times New Roman" w:cs="Times New Roman" w:eastAsia="Times New Roman" w:hAnsi="Times New Roman"/>
+          <w:b w:val="false"/>
+          <w:bCs w:val="false"/>
+          <w:i/>
+          <w:iCs/>
+          <w:sz w:val="24"/>
+          <w:szCs w:val="24"/>
+        </w:rPr>
+        <w:t xml:space="preserve">et al.</w:t>
+      </w:r>
+      <w:r>
+        <w:rPr>
+          <w:rFonts w:ascii="Times New Roman" w:cs="Times New Roman" w:eastAsia="Times New Roman" w:hAnsi="Times New Roman"/>
+          <w:b w:val="false"/>
+          <w:bCs w:val="false"/>
+          <w:i w:val="false"/>
+          <w:iCs w:val="false"/>
+          <w:sz w:val="24"/>
+          <w:szCs w:val="24"/>
+        </w:rPr>
+        <w:t xml:space="preserve">, 2015; Hirota </w:t>
+      </w:r>
+      <w:r>
+        <w:rPr>
+          <w:rFonts w:ascii="Times New Roman" w:cs="Times New Roman" w:eastAsia="Times New Roman" w:hAnsi="Times New Roman"/>
+          <w:b w:val="false"/>
+          <w:bCs w:val="false"/>
+          <w:i/>
+          <w:iCs/>
+          <w:sz w:val="24"/>
+          <w:szCs w:val="24"/>
+        </w:rPr>
+        <w:t xml:space="preserve">et al.</w:t>
+      </w:r>
+      <w:r>
+        <w:rPr>
+          <w:rFonts w:ascii="Times New Roman" w:cs="Times New Roman" w:eastAsia="Times New Roman" w:hAnsi="Times New Roman"/>
+          <w:b w:val="false"/>
+          <w:bCs w:val="false"/>
+          <w:i w:val="false"/>
+          <w:iCs w:val="false"/>
+          <w:sz w:val="24"/>
+          <w:szCs w:val="24"/>
+        </w:rPr>
+        <w:t xml:space="preserve">, 2013; Portello </w:t>
+      </w:r>
+      <w:r>
+        <w:rPr>
+          <w:rFonts w:ascii="Times New Roman" w:cs="Times New Roman" w:eastAsia="Times New Roman" w:hAnsi="Times New Roman"/>
+          <w:b w:val="false"/>
+          <w:bCs w:val="false"/>
+          <w:i/>
+          <w:iCs/>
+          <w:sz w:val="24"/>
+          <w:szCs w:val="24"/>
+        </w:rPr>
+        <w:t xml:space="preserve">et al.</w:t>
+      </w:r>
+      <w:r>
+        <w:rPr>
+          <w:rFonts w:ascii="Times New Roman" w:cs="Times New Roman" w:eastAsia="Times New Roman" w:hAnsi="Times New Roman"/>
+          <w:b w:val="false"/>
+          <w:bCs w:val="false"/>
+          <w:i w:val="false"/>
+          <w:iCs w:val="false"/>
+          <w:sz w:val="24"/>
+          <w:szCs w:val="24"/>
+        </w:rPr>
+        <w:t xml:space="preserve">, 2013), and no automated implementation has been validated against manual annotation in the literature located, so the measure does not scale.</w:t>
       </w:r>
     </w:p>
     <w:p>
@@ -11234,7 +13250,19 @@
                 <w:sz w:val="15"/>
                 <w:szCs w:val="15"/>
               </w:rPr>
-              <w:t xml:space="preserve">Hirota et al.</w:t>
+              <w:t xml:space="preserve">Hirota </w:t>
+            </w:r>
+            <w:r>
+              <w:rPr>
+                <w:rFonts w:ascii="Times New Roman" w:cs="Times New Roman" w:eastAsia="Times New Roman" w:hAnsi="Times New Roman"/>
+                <w:b w:val="false"/>
+                <w:bCs w:val="false"/>
+                <w:i/>
+                <w:iCs/>
+                <w:sz w:val="15"/>
+                <w:szCs w:val="15"/>
+              </w:rPr>
+              <w:t xml:space="preserve">et al.</w:t>
             </w:r>
           </w:p>
         </w:tc>
@@ -11432,7 +13460,19 @@
                 <w:sz w:val="15"/>
                 <w:szCs w:val="15"/>
               </w:rPr>
-              <w:t xml:space="preserve">Jackson et al.</w:t>
+              <w:t xml:space="preserve">Jackson </w:t>
+            </w:r>
+            <w:r>
+              <w:rPr>
+                <w:rFonts w:ascii="Times New Roman" w:cs="Times New Roman" w:eastAsia="Times New Roman" w:hAnsi="Times New Roman"/>
+                <w:b w:val="false"/>
+                <w:bCs w:val="false"/>
+                <w:i/>
+                <w:iCs/>
+                <w:sz w:val="15"/>
+                <w:szCs w:val="15"/>
+              </w:rPr>
+              <w:t xml:space="preserve">et al.</w:t>
             </w:r>
           </w:p>
         </w:tc>
@@ -11630,7 +13670,19 @@
                 <w:sz w:val="15"/>
                 <w:szCs w:val="15"/>
               </w:rPr>
-              <w:t xml:space="preserve">Jiménez et al.</w:t>
+              <w:t xml:space="preserve">Jiménez </w:t>
+            </w:r>
+            <w:r>
+              <w:rPr>
+                <w:rFonts w:ascii="Times New Roman" w:cs="Times New Roman" w:eastAsia="Times New Roman" w:hAnsi="Times New Roman"/>
+                <w:b w:val="false"/>
+                <w:bCs w:val="false"/>
+                <w:i/>
+                <w:iCs/>
+                <w:sz w:val="15"/>
+                <w:szCs w:val="15"/>
+              </w:rPr>
+              <w:t xml:space="preserve">et al.</w:t>
             </w:r>
           </w:p>
         </w:tc>
@@ -11828,7 +13880,19 @@
                 <w:sz w:val="15"/>
                 <w:szCs w:val="15"/>
               </w:rPr>
-              <w:t xml:space="preserve">Portello et al.</w:t>
+              <w:t xml:space="preserve">Portello </w:t>
+            </w:r>
+            <w:r>
+              <w:rPr>
+                <w:rFonts w:ascii="Times New Roman" w:cs="Times New Roman" w:eastAsia="Times New Roman" w:hAnsi="Times New Roman"/>
+                <w:b w:val="false"/>
+                <w:bCs w:val="false"/>
+                <w:i/>
+                <w:iCs/>
+                <w:sz w:val="15"/>
+                <w:szCs w:val="15"/>
+              </w:rPr>
+              <w:t xml:space="preserve">et al.</w:t>
             </w:r>
           </w:p>
         </w:tc>
@@ -12026,7 +14090,19 @@
                 <w:sz w:val="15"/>
                 <w:szCs w:val="15"/>
               </w:rPr>
-              <w:t xml:space="preserve">Cardona et al.</w:t>
+              <w:t xml:space="preserve">Cardona </w:t>
+            </w:r>
+            <w:r>
+              <w:rPr>
+                <w:rFonts w:ascii="Times New Roman" w:cs="Times New Roman" w:eastAsia="Times New Roman" w:hAnsi="Times New Roman"/>
+                <w:b w:val="false"/>
+                <w:bCs w:val="false"/>
+                <w:i/>
+                <w:iCs/>
+                <w:sz w:val="15"/>
+                <w:szCs w:val="15"/>
+              </w:rPr>
+              <w:t xml:space="preserve">et al.</w:t>
             </w:r>
           </w:p>
         </w:tc>
@@ -12448,7 +14524,19 @@
                 <w:sz w:val="15"/>
                 <w:szCs w:val="15"/>
               </w:rPr>
-              <w:t xml:space="preserve">Argilés et al.</w:t>
+              <w:t xml:space="preserve">Argilés </w:t>
+            </w:r>
+            <w:r>
+              <w:rPr>
+                <w:rFonts w:ascii="Times New Roman" w:cs="Times New Roman" w:eastAsia="Times New Roman" w:hAnsi="Times New Roman"/>
+                <w:b w:val="false"/>
+                <w:bCs w:val="false"/>
+                <w:i/>
+                <w:iCs/>
+                <w:sz w:val="15"/>
+                <w:szCs w:val="15"/>
+              </w:rPr>
+              <w:t xml:space="preserve">et al.</w:t>
             </w:r>
           </w:p>
         </w:tc>
@@ -13427,7 +15515,31 @@
           <w:sz w:val="24"/>
           <w:szCs w:val="24"/>
         </w:rPr>
-        <w:t xml:space="preserve"> Screening comprises visual acuity, non-cycloplegic refraction, cover test, near point of convergence, and Ishihara colour-vision screening on the study display, for which sensitivity was 94.4 per cent and specificity 82.4 per cent on a calibrated monitor and 96.0 and 94.7 per cent on a smartphone, with no significant difference between modes (Klinke et al., 2024). Screening is an aid rather than a diagnosis, and outcomes are recorded as covariates. Participants also complete a profiling questionnaire covering habitual display-mode preference, screen exposure, lighting environment, familiarity with coloured interfaces, digital literacy, hours since waking and recent caffeine intake, which supply the moderators for Objective 3 and the sleepiness covariates.</w:t>
+        <w:t xml:space="preserve"> Screening comprises visual acuity, non-cycloplegic refraction, cover test, near point of convergence, and Ishihara colour-vision screening on the study display, for which sensitivity was 94.4 per cent and specificity 82.4 per cent on a calibrated monitor and 96.0 and 94.7 per cent on a smartphone, with no significant difference between modes (Klinke </w:t>
+      </w:r>
+      <w:r>
+        <w:rPr>
+          <w:rFonts w:ascii="Times New Roman" w:cs="Times New Roman" w:eastAsia="Times New Roman" w:hAnsi="Times New Roman"/>
+          <w:b w:val="false"/>
+          <w:bCs w:val="false"/>
+          <w:i/>
+          <w:iCs/>
+          <w:sz w:val="24"/>
+          <w:szCs w:val="24"/>
+        </w:rPr>
+        <w:t xml:space="preserve">et al.</w:t>
+      </w:r>
+      <w:r>
+        <w:rPr>
+          <w:rFonts w:ascii="Times New Roman" w:cs="Times New Roman" w:eastAsia="Times New Roman" w:hAnsi="Times New Roman"/>
+          <w:b w:val="false"/>
+          <w:bCs w:val="false"/>
+          <w:i w:val="false"/>
+          <w:iCs w:val="false"/>
+          <w:sz w:val="24"/>
+          <w:szCs w:val="24"/>
+        </w:rPr>
+        <w:t xml:space="preserve">, 2024). Screening is an aid rather than a diagnosis, and outcomes are recorded as covariates. Participants also complete a profiling questionnaire covering habitual display-mode preference, screen exposure, lighting environment, familiarity with coloured interfaces, digital literacy, hours since waking and recent caffeine intake, which supply the moderators for Objective 3 and the sleepiness covariates.</w:t>
       </w:r>
     </w:p>
     <w:p>
@@ -13859,7 +15971,31 @@
           <w:sz w:val="24"/>
           <w:szCs w:val="24"/>
         </w:rPr>
-        <w:t xml:space="preserve">All conditions are presented on a single fixed tablet at a viewing distance of 50 to 60 cm, with brightness fixed, automatic brightness and any blue-light filter disabled, and the screen cleaned before each session. Display white-point luminance is measured photometrically and recorded per session, with a working target of 120 to 150 cd/m², informed by the optimum of 153 cd/m² determined under 300 lux (Lin et al., 2024) and scaled for the lower domestic illuminance used here. Typography, line height and margins are fixed across conditions, so that polarity and colour are the only stimulus properties that vary. Contrast is computed from linearised sRGB relative luminance following the accessibility standard (World Wide Web Consortium, 2023). The five text colours were retained from the locked condition set used earlier in this programme, with green added so that the number of sub-AA conditions is balanced at two per polarity.</w:t>
+        <w:t xml:space="preserve">All conditions are presented on a single fixed tablet at a viewing distance of 50 to 60 cm, with brightness fixed, automatic brightness and any blue-light filter disabled, and the screen cleaned before each session. Display white-point luminance is measured photometrically and recorded per session, with a working target of 120 to 150 cd/m², informed by the optimum of 153 cd/m² determined under 300 lux (Lin </w:t>
+      </w:r>
+      <w:r>
+        <w:rPr>
+          <w:rFonts w:ascii="Times New Roman" w:cs="Times New Roman" w:eastAsia="Times New Roman" w:hAnsi="Times New Roman"/>
+          <w:b w:val="false"/>
+          <w:bCs w:val="false"/>
+          <w:i/>
+          <w:iCs/>
+          <w:sz w:val="24"/>
+          <w:szCs w:val="24"/>
+        </w:rPr>
+        <w:t xml:space="preserve">et al.</w:t>
+      </w:r>
+      <w:r>
+        <w:rPr>
+          <w:rFonts w:ascii="Times New Roman" w:cs="Times New Roman" w:eastAsia="Times New Roman" w:hAnsi="Times New Roman"/>
+          <w:b w:val="false"/>
+          <w:bCs w:val="false"/>
+          <w:i w:val="false"/>
+          <w:iCs w:val="false"/>
+          <w:sz w:val="24"/>
+          <w:szCs w:val="24"/>
+        </w:rPr>
+        <w:t xml:space="preserve">, 2024) and scaled for the lower domestic illuminance used here. Typography, line height and margins are fixed across conditions, so that polarity and colour are the only stimulus properties that vary. Contrast is computed from linearised sRGB relative luminance following the accessibility standard (World Wide Web Consortium, 2023). The five text colours were retained from the locked condition set used earlier in this programme, with green added so that the number of sub-AA conditions is balanced at two per polarity.</w:t>
       </w:r>
     </w:p>
     <w:p>
@@ -16949,7 +19085,127 @@
           <w:sz w:val="24"/>
           <w:szCs w:val="24"/>
         </w:rPr>
-        <w:t xml:space="preserve">Illuminance is set and verified at the participant's eye position and at the display plane with a calibrated lux meter, and logged at the start, middle and end of each session. The dim level targets approximately 10 lux (acceptable range 5–15), representing night-time and low-light domestic use and comparable to the low-illumination conditions of prior polarity work (Dobres et al., 2017; Fan et al., 2024). The moderate level targets approximately 150 lux (range 130–170), representing general indoor domestic lighting and set deliberately below the 300–500 lux specified for offices and classrooms in the Indian interior-illumination code (Bureau of Indian Standards, 2009) and below the 300 lux reference used in recent display optimisation (Lin et al., 2024). Two levels rather than a graded series were chosen so that illumination could be crossed with all ten display conditions within a feasible protocol. The values were selected to fall either side of the range at which negative-polarity penalties have been reported to emerge (Dobres et al., 2017; Fan et al., 2024) and to differ by approximately one log unit, so that a pupillary difference is physiologically plausible. Because display white luminance is held constant, the display-to-ambient luminance ratio, which is the quantity the polarity account implicates, differs by design between sessions. Correlated colour temperature and light-source type are held constant across both levels, so illuminance is the only photometric property of the room that varies.</w:t>
+        <w:t xml:space="preserve">Illuminance is set and verified at the participant's eye position and at the display plane with a calibrated lux meter, and logged at the start, middle and end of each session. The dim level targets approximately 10 lux (acceptable range 5–15), representing night-time and low-light domestic use and comparable to the low-illumination conditions of prior polarity work (Dobres </w:t>
+      </w:r>
+      <w:r>
+        <w:rPr>
+          <w:rFonts w:ascii="Times New Roman" w:cs="Times New Roman" w:eastAsia="Times New Roman" w:hAnsi="Times New Roman"/>
+          <w:b w:val="false"/>
+          <w:bCs w:val="false"/>
+          <w:i/>
+          <w:iCs/>
+          <w:sz w:val="24"/>
+          <w:szCs w:val="24"/>
+        </w:rPr>
+        <w:t xml:space="preserve">et al.</w:t>
+      </w:r>
+      <w:r>
+        <w:rPr>
+          <w:rFonts w:ascii="Times New Roman" w:cs="Times New Roman" w:eastAsia="Times New Roman" w:hAnsi="Times New Roman"/>
+          <w:b w:val="false"/>
+          <w:bCs w:val="false"/>
+          <w:i w:val="false"/>
+          <w:iCs w:val="false"/>
+          <w:sz w:val="24"/>
+          <w:szCs w:val="24"/>
+        </w:rPr>
+        <w:t xml:space="preserve">, 2017; Fan </w:t>
+      </w:r>
+      <w:r>
+        <w:rPr>
+          <w:rFonts w:ascii="Times New Roman" w:cs="Times New Roman" w:eastAsia="Times New Roman" w:hAnsi="Times New Roman"/>
+          <w:b w:val="false"/>
+          <w:bCs w:val="false"/>
+          <w:i/>
+          <w:iCs/>
+          <w:sz w:val="24"/>
+          <w:szCs w:val="24"/>
+        </w:rPr>
+        <w:t xml:space="preserve">et al.</w:t>
+      </w:r>
+      <w:r>
+        <w:rPr>
+          <w:rFonts w:ascii="Times New Roman" w:cs="Times New Roman" w:eastAsia="Times New Roman" w:hAnsi="Times New Roman"/>
+          <w:b w:val="false"/>
+          <w:bCs w:val="false"/>
+          <w:i w:val="false"/>
+          <w:iCs w:val="false"/>
+          <w:sz w:val="24"/>
+          <w:szCs w:val="24"/>
+        </w:rPr>
+        <w:t xml:space="preserve">, 2024). The moderate level targets approximately 150 lux (range 130–170), representing general indoor domestic lighting and set deliberately below the 300–500 lux specified for offices and classrooms in the Indian interior-illumination code (Bureau of Indian Standards, 2009) and below the 300 lux reference used in recent display optimisation (Lin </w:t>
+      </w:r>
+      <w:r>
+        <w:rPr>
+          <w:rFonts w:ascii="Times New Roman" w:cs="Times New Roman" w:eastAsia="Times New Roman" w:hAnsi="Times New Roman"/>
+          <w:b w:val="false"/>
+          <w:bCs w:val="false"/>
+          <w:i/>
+          <w:iCs/>
+          <w:sz w:val="24"/>
+          <w:szCs w:val="24"/>
+        </w:rPr>
+        <w:t xml:space="preserve">et al.</w:t>
+      </w:r>
+      <w:r>
+        <w:rPr>
+          <w:rFonts w:ascii="Times New Roman" w:cs="Times New Roman" w:eastAsia="Times New Roman" w:hAnsi="Times New Roman"/>
+          <w:b w:val="false"/>
+          <w:bCs w:val="false"/>
+          <w:i w:val="false"/>
+          <w:iCs w:val="false"/>
+          <w:sz w:val="24"/>
+          <w:szCs w:val="24"/>
+        </w:rPr>
+        <w:t xml:space="preserve">, 2024). Two levels rather than a graded series were chosen so that illumination could be crossed with all ten display conditions within a feasible protocol. The values were selected to fall either side of the range at which negative-polarity penalties have been reported to emerge (Dobres </w:t>
+      </w:r>
+      <w:r>
+        <w:rPr>
+          <w:rFonts w:ascii="Times New Roman" w:cs="Times New Roman" w:eastAsia="Times New Roman" w:hAnsi="Times New Roman"/>
+          <w:b w:val="false"/>
+          <w:bCs w:val="false"/>
+          <w:i/>
+          <w:iCs/>
+          <w:sz w:val="24"/>
+          <w:szCs w:val="24"/>
+        </w:rPr>
+        <w:t xml:space="preserve">et al.</w:t>
+      </w:r>
+      <w:r>
+        <w:rPr>
+          <w:rFonts w:ascii="Times New Roman" w:cs="Times New Roman" w:eastAsia="Times New Roman" w:hAnsi="Times New Roman"/>
+          <w:b w:val="false"/>
+          <w:bCs w:val="false"/>
+          <w:i w:val="false"/>
+          <w:iCs w:val="false"/>
+          <w:sz w:val="24"/>
+          <w:szCs w:val="24"/>
+        </w:rPr>
+        <w:t xml:space="preserve">, 2017; Fan </w:t>
+      </w:r>
+      <w:r>
+        <w:rPr>
+          <w:rFonts w:ascii="Times New Roman" w:cs="Times New Roman" w:eastAsia="Times New Roman" w:hAnsi="Times New Roman"/>
+          <w:b w:val="false"/>
+          <w:bCs w:val="false"/>
+          <w:i/>
+          <w:iCs/>
+          <w:sz w:val="24"/>
+          <w:szCs w:val="24"/>
+        </w:rPr>
+        <w:t xml:space="preserve">et al.</w:t>
+      </w:r>
+      <w:r>
+        <w:rPr>
+          <w:rFonts w:ascii="Times New Roman" w:cs="Times New Roman" w:eastAsia="Times New Roman" w:hAnsi="Times New Roman"/>
+          <w:b w:val="false"/>
+          <w:bCs w:val="false"/>
+          <w:i w:val="false"/>
+          <w:iCs w:val="false"/>
+          <w:sz w:val="24"/>
+          <w:szCs w:val="24"/>
+        </w:rPr>
+        <w:t xml:space="preserve">, 2024) and to differ by approximately one log unit, so that a pupillary difference is physiologically plausible. Because display white luminance is held constant, the display-to-ambient luminance ratio, which is the quantity the polarity account implicates, differs by design between sessions. Correlated colour temperature and light-source type are held constant across both levels, so illuminance is the only photometric property of the room that varies.</w:t>
       </w:r>
     </w:p>
     <w:p>
@@ -17099,7 +19355,7 @@
           <w:sz w:val="24"/>
           <w:szCs w:val="24"/>
         </w:rPr>
-        <w:t xml:space="preserve"> The incomplete-blink ratio is a binomial proportion, so its precision within a condition depends entirely on how many blinks that condition captures. At a reading blink rate of about 13 per minute a 70-second exposure yields some 16 blinks, giving a standard error near 0.09 for a ratio around 0.16. A three-minute exposure — the segment length the annotation sub-study already assumes — yields about 39 blinks and roughly halves that error, at a cost of some 20 minutes per sitting that the budget in §3.6 accommodates. The passages will accordingly be lengthened before the pilot to deliver a three-minute window per condition. The blinks contributing to each condition are recorded alongside the ratio, and any run yielding fewer than 20 is flagged for down-weighting or exclusion in a sensitivity analysis rather than treated as a precise estimate.</w:t>
+        <w:t xml:space="preserve"> The incomplete-blink ratio is a binomial proportion, so its precision within a condition depends entirely on how many blinks that condition captures. At a reading blink rate of about 13 per minute a 70-second exposure yields some 16 blinks, giving a standard error near 0.09 for a ratio around 0.16. A three-minute exposure — the segment length the annotation sub-study already assumes — yields about 39 blinks and roughly halves that error, at a cost of some 20 minutes per sitting that the budget in §3.6 accommodates. The passages have accordingly been set at four pages and approximately 600 words, which delivers a measured exposure of 178 seconds per condition. The blinks contributing to each condition are recorded alongside the ratio, and any run yielding fewer than 20 is flagged for down-weighting or exclusion in a sensitivity analysis rather than treated as a precise estimate.</w:t>
       </w:r>
     </w:p>
     <w:p>
@@ -17504,7 +19760,31 @@
           <w:sz w:val="24"/>
           <w:szCs w:val="24"/>
         </w:rPr>
-        <w:t xml:space="preserve">The reaction-time target is achromatic and defined relative to the active background, black on light fields and white on dark ones, with the chromatic set as distractors. Target contrast is therefore maximal and identical in both polarities, so salience does not vary with condition and no hue coincides with the text-colour manipulation. The discrimination becomes achromatic against chromatic rather than hue against hue, which simplifies it but preserves the fatigue-sensitive indices of reaction-time variability and lapse rate (Abe et al., 2014).</w:t>
+        <w:t xml:space="preserve">The reaction-time target is achromatic and defined relative to the active background, black on light fields and white on dark ones, with the chromatic set as distractors. Target contrast is therefore maximal and identical in both polarities, so salience does not vary with condition and no hue coincides with the text-colour manipulation. The discrimination becomes achromatic against chromatic rather than hue against hue, which simplifies it but preserves the fatigue-sensitive indices of reaction-time variability and lapse rate (Abe </w:t>
+      </w:r>
+      <w:r>
+        <w:rPr>
+          <w:rFonts w:ascii="Times New Roman" w:cs="Times New Roman" w:eastAsia="Times New Roman" w:hAnsi="Times New Roman"/>
+          <w:b w:val="false"/>
+          <w:bCs w:val="false"/>
+          <w:i/>
+          <w:iCs/>
+          <w:sz w:val="24"/>
+          <w:szCs w:val="24"/>
+        </w:rPr>
+        <w:t xml:space="preserve">et al.</w:t>
+      </w:r>
+      <w:r>
+        <w:rPr>
+          <w:rFonts w:ascii="Times New Roman" w:cs="Times New Roman" w:eastAsia="Times New Roman" w:hAnsi="Times New Roman"/>
+          <w:b w:val="false"/>
+          <w:bCs w:val="false"/>
+          <w:i w:val="false"/>
+          <w:iCs w:val="false"/>
+          <w:sz w:val="24"/>
+          <w:szCs w:val="24"/>
+        </w:rPr>
+        <w:t xml:space="preserve">, 2014).</w:t>
       </w:r>
     </w:p>
     <w:p>
@@ -17535,7 +19815,7 @@
           <w:sz w:val="24"/>
           <w:szCs w:val="24"/>
         </w:rPr>
-        <w:t xml:space="preserve"> A protocol simulation over 2,000 synthetic participants, using reading rates drawn from the published meta-analytic distribution for adult non-fiction reading and the timing constants of the instrument itself, estimates a median sitting of approximately 75 minutes at the present reading length and 93 minutes at the three-minute exposure proposed in §3.5, with the ninety-fifth percentile below 110 minutes in both cases. A pilot of ten participants will nevertheless precede the main study to assess session tolerability, dropout, data quality and completion time against observed rather than simulated values. The pre-specified criteria for retaining the two-session structure are a median session duration of not more than 120 minutes, no more than one withdrawal in ten, and a face-presence ratio of at least 0.90 in at least 90 per cent of condition-runs. If any criterion is not met, each illumination level will be divided into two shorter sittings of five conditions, preserving the counterbalancing scheme and the global serial-position record.</w:t>
+        <w:t xml:space="preserve"> A protocol simulation over 2,000 synthetic participants, using reading rates drawn from the published meta-analytic distribution for adult non-fiction reading and the timing constants of the instrument itself, estimates a median sitting of 92 minutes at the three-minute exposure specified in §3.5, with a ninety-fifth percentile of 112 minutes and 1.5 per cent of participants exceeding two hours. A pilot of ten participants will nevertheless precede the main study to assess session tolerability, dropout, data quality and completion time against observed rather than simulated values. The pre-specified criteria for retaining the two-session structure are a median session duration of not more than 120 minutes, no more than one withdrawal in ten, and a face-presence ratio of at least 0.90 in at least 90 per cent of condition-runs. If any criterion is not met, each illumination level will be divided into two shorter sittings of five conditions, preserving the counterbalancing scheme and the global serial-position record.</w:t>
       </w:r>
     </w:p>
     <w:p>
@@ -17874,7 +20154,31 @@
                 <w:sz w:val="15"/>
                 <w:szCs w:val="15"/>
               </w:rPr>
-              <w:t xml:space="preserve">CVS-Q score and change from baseline (key secondary) (Seguí et al., 2015); five-item visual-fatigue VAS (0–10) per condition</w:t>
+              <w:t xml:space="preserve">CVS-Q score and change from baseline (key secondary) (Seguí </w:t>
+            </w:r>
+            <w:r>
+              <w:rPr>
+                <w:rFonts w:ascii="Times New Roman" w:cs="Times New Roman" w:eastAsia="Times New Roman" w:hAnsi="Times New Roman"/>
+                <w:b w:val="false"/>
+                <w:bCs w:val="false"/>
+                <w:i/>
+                <w:iCs/>
+                <w:sz w:val="15"/>
+                <w:szCs w:val="15"/>
+              </w:rPr>
+              <w:t xml:space="preserve">et al.</w:t>
+            </w:r>
+            <w:r>
+              <w:rPr>
+                <w:rFonts w:ascii="Times New Roman" w:cs="Times New Roman" w:eastAsia="Times New Roman" w:hAnsi="Times New Roman"/>
+                <w:b w:val="false"/>
+                <w:bCs w:val="false"/>
+                <w:i w:val="false"/>
+                <w:iCs w:val="false"/>
+                <w:sz w:val="15"/>
+                <w:szCs w:val="15"/>
+              </w:rPr>
+              <w:t xml:space="preserve">, 2015); five-item visual-fatigue VAS (0–10) per condition</w:t>
             </w:r>
           </w:p>
         </w:tc>

</xml_diff>

<commit_message>
synopsis: the reference list was justified with no hanging indent
APA 7 sets a reference list flush left with a half-inch hanging indent. This one
inherited the body's justification, so long DOIs and journal titles opened
rivers of white space across the line, and with every entry starting at the
margin the author column could not be scanned — the two things an examiner
checking format looks at first.

The builder now tracks whether it is inside the reference list and formats those
paragraphs accordingly, rather than treating every paragraph in the document as
body prose. A test holds it there.

Co-Authored-By: Claude Opus 5 <noreply@anthropic.com>
Claude-Session: https://claude.ai/code/session_01Y21CLUtoD2HT4KcbvaYcRZ
</commit_message>
<xml_diff>
--- a/synopsis/Synopsis_Gyandeep_Nath_AdtU.docx
+++ b/synopsis/Synopsis_Gyandeep_Nath_AdtU.docx
@@ -18106,8 +18106,9 @@
     </w:p>
     <w:p>
       <w:pPr>
-        <w:spacing w:after="140" w:line="340" w:lineRule="auto"/>
-        <w:jc w:val="both"/>
+        <w:spacing w:after="100" w:line="340" w:lineRule="auto"/>
+        <w:ind w:left="720" w:hanging="720"/>
+        <w:jc w:val="left"/>
       </w:pPr>
       <w:r>
         <w:rPr>
@@ -18172,8 +18173,9 @@
     </w:p>
     <w:p>
       <w:pPr>
-        <w:spacing w:after="140" w:line="340" w:lineRule="auto"/>
-        <w:jc w:val="both"/>
+        <w:spacing w:after="100" w:line="340" w:lineRule="auto"/>
+        <w:ind w:left="720" w:hanging="720"/>
+        <w:jc w:val="left"/>
       </w:pPr>
       <w:r>
         <w:rPr>
@@ -18238,8 +18240,9 @@
     </w:p>
     <w:p>
       <w:pPr>
-        <w:spacing w:after="140" w:line="340" w:lineRule="auto"/>
-        <w:jc w:val="both"/>
+        <w:spacing w:after="100" w:line="340" w:lineRule="auto"/>
+        <w:ind w:left="720" w:hanging="720"/>
+        <w:jc w:val="left"/>
       </w:pPr>
       <w:r>
         <w:rPr>
@@ -18304,8 +18307,9 @@
     </w:p>
     <w:p>
       <w:pPr>
-        <w:spacing w:after="140" w:line="340" w:lineRule="auto"/>
-        <w:jc w:val="both"/>
+        <w:spacing w:after="100" w:line="340" w:lineRule="auto"/>
+        <w:ind w:left="720" w:hanging="720"/>
+        <w:jc w:val="left"/>
       </w:pPr>
       <w:r>
         <w:rPr>
@@ -18370,8 +18374,9 @@
     </w:p>
     <w:p>
       <w:pPr>
-        <w:spacing w:after="140" w:line="340" w:lineRule="auto"/>
-        <w:jc w:val="both"/>
+        <w:spacing w:after="100" w:line="340" w:lineRule="auto"/>
+        <w:ind w:left="720" w:hanging="720"/>
+        <w:jc w:val="left"/>
       </w:pPr>
       <w:r>
         <w:rPr>
@@ -18436,8 +18441,9 @@
     </w:p>
     <w:p>
       <w:pPr>
-        <w:spacing w:after="140" w:line="340" w:lineRule="auto"/>
-        <w:jc w:val="both"/>
+        <w:spacing w:after="100" w:line="340" w:lineRule="auto"/>
+        <w:ind w:left="720" w:hanging="720"/>
+        <w:jc w:val="left"/>
       </w:pPr>
       <w:r>
         <w:rPr>
@@ -18502,8 +18508,9 @@
     </w:p>
     <w:p>
       <w:pPr>
-        <w:spacing w:after="140" w:line="340" w:lineRule="auto"/>
-        <w:jc w:val="both"/>
+        <w:spacing w:after="100" w:line="340" w:lineRule="auto"/>
+        <w:ind w:left="720" w:hanging="720"/>
+        <w:jc w:val="left"/>
       </w:pPr>
       <w:r>
         <w:rPr>
@@ -18568,8 +18575,9 @@
     </w:p>
     <w:p>
       <w:pPr>
-        <w:spacing w:after="140" w:line="340" w:lineRule="auto"/>
-        <w:jc w:val="both"/>
+        <w:spacing w:after="100" w:line="340" w:lineRule="auto"/>
+        <w:ind w:left="720" w:hanging="720"/>
+        <w:jc w:val="left"/>
       </w:pPr>
       <w:r>
         <w:rPr>
@@ -18634,8 +18642,9 @@
     </w:p>
     <w:p>
       <w:pPr>
-        <w:spacing w:after="140" w:line="340" w:lineRule="auto"/>
-        <w:jc w:val="both"/>
+        <w:spacing w:after="100" w:line="340" w:lineRule="auto"/>
+        <w:ind w:left="720" w:hanging="720"/>
+        <w:jc w:val="left"/>
       </w:pPr>
       <w:r>
         <w:rPr>
@@ -18700,8 +18709,9 @@
     </w:p>
     <w:p>
       <w:pPr>
-        <w:spacing w:after="140" w:line="340" w:lineRule="auto"/>
-        <w:jc w:val="both"/>
+        <w:spacing w:after="100" w:line="340" w:lineRule="auto"/>
+        <w:ind w:left="720" w:hanging="720"/>
+        <w:jc w:val="left"/>
       </w:pPr>
       <w:r>
         <w:rPr>
@@ -18766,8 +18776,9 @@
     </w:p>
     <w:p>
       <w:pPr>
-        <w:spacing w:after="140" w:line="340" w:lineRule="auto"/>
-        <w:jc w:val="both"/>
+        <w:spacing w:after="100" w:line="340" w:lineRule="auto"/>
+        <w:ind w:left="720" w:hanging="720"/>
+        <w:jc w:val="left"/>
       </w:pPr>
       <w:r>
         <w:rPr>
@@ -18832,8 +18843,9 @@
     </w:p>
     <w:p>
       <w:pPr>
-        <w:spacing w:after="140" w:line="340" w:lineRule="auto"/>
-        <w:jc w:val="both"/>
+        <w:spacing w:after="100" w:line="340" w:lineRule="auto"/>
+        <w:ind w:left="720" w:hanging="720"/>
+        <w:jc w:val="left"/>
       </w:pPr>
       <w:r>
         <w:rPr>
@@ -18898,8 +18910,9 @@
     </w:p>
     <w:p>
       <w:pPr>
-        <w:spacing w:after="140" w:line="340" w:lineRule="auto"/>
-        <w:jc w:val="both"/>
+        <w:spacing w:after="100" w:line="340" w:lineRule="auto"/>
+        <w:ind w:left="720" w:hanging="720"/>
+        <w:jc w:val="left"/>
       </w:pPr>
       <w:r>
         <w:rPr>
@@ -18964,8 +18977,9 @@
     </w:p>
     <w:p>
       <w:pPr>
-        <w:spacing w:after="140" w:line="340" w:lineRule="auto"/>
-        <w:jc w:val="both"/>
+        <w:spacing w:after="100" w:line="340" w:lineRule="auto"/>
+        <w:ind w:left="720" w:hanging="720"/>
+        <w:jc w:val="left"/>
       </w:pPr>
       <w:r>
         <w:rPr>
@@ -19030,8 +19044,9 @@
     </w:p>
     <w:p>
       <w:pPr>
-        <w:spacing w:after="140" w:line="340" w:lineRule="auto"/>
-        <w:jc w:val="both"/>
+        <w:spacing w:after="100" w:line="340" w:lineRule="auto"/>
+        <w:ind w:left="720" w:hanging="720"/>
+        <w:jc w:val="left"/>
       </w:pPr>
       <w:r>
         <w:rPr>
@@ -19072,8 +19087,9 @@
     </w:p>
     <w:p>
       <w:pPr>
-        <w:spacing w:after="140" w:line="340" w:lineRule="auto"/>
-        <w:jc w:val="both"/>
+        <w:spacing w:after="100" w:line="340" w:lineRule="auto"/>
+        <w:ind w:left="720" w:hanging="720"/>
+        <w:jc w:val="left"/>
       </w:pPr>
       <w:r>
         <w:rPr>
@@ -19138,8 +19154,9 @@
     </w:p>
     <w:p>
       <w:pPr>
-        <w:spacing w:after="140" w:line="340" w:lineRule="auto"/>
-        <w:jc w:val="both"/>
+        <w:spacing w:after="100" w:line="340" w:lineRule="auto"/>
+        <w:ind w:left="720" w:hanging="720"/>
+        <w:jc w:val="left"/>
       </w:pPr>
       <w:r>
         <w:rPr>
@@ -19204,8 +19221,9 @@
     </w:p>
     <w:p>
       <w:pPr>
-        <w:spacing w:after="140" w:line="340" w:lineRule="auto"/>
-        <w:jc w:val="both"/>
+        <w:spacing w:after="100" w:line="340" w:lineRule="auto"/>
+        <w:ind w:left="720" w:hanging="720"/>
+        <w:jc w:val="left"/>
       </w:pPr>
       <w:r>
         <w:rPr>
@@ -19270,8 +19288,9 @@
     </w:p>
     <w:p>
       <w:pPr>
-        <w:spacing w:after="140" w:line="340" w:lineRule="auto"/>
-        <w:jc w:val="both"/>
+        <w:spacing w:after="100" w:line="340" w:lineRule="auto"/>
+        <w:ind w:left="720" w:hanging="720"/>
+        <w:jc w:val="left"/>
       </w:pPr>
       <w:r>
         <w:rPr>
@@ -19336,8 +19355,9 @@
     </w:p>
     <w:p>
       <w:pPr>
-        <w:spacing w:after="140" w:line="340" w:lineRule="auto"/>
-        <w:jc w:val="both"/>
+        <w:spacing w:after="100" w:line="340" w:lineRule="auto"/>
+        <w:ind w:left="720" w:hanging="720"/>
+        <w:jc w:val="left"/>
       </w:pPr>
       <w:r>
         <w:rPr>
@@ -19402,8 +19422,9 @@
     </w:p>
     <w:p>
       <w:pPr>
-        <w:spacing w:after="140" w:line="340" w:lineRule="auto"/>
-        <w:jc w:val="both"/>
+        <w:spacing w:after="100" w:line="340" w:lineRule="auto"/>
+        <w:ind w:left="720" w:hanging="720"/>
+        <w:jc w:val="left"/>
       </w:pPr>
       <w:r>
         <w:rPr>
@@ -19468,8 +19489,9 @@
     </w:p>
     <w:p>
       <w:pPr>
-        <w:spacing w:after="140" w:line="340" w:lineRule="auto"/>
-        <w:jc w:val="both"/>
+        <w:spacing w:after="100" w:line="340" w:lineRule="auto"/>
+        <w:ind w:left="720" w:hanging="720"/>
+        <w:jc w:val="left"/>
       </w:pPr>
       <w:r>
         <w:rPr>
@@ -19534,8 +19556,9 @@
     </w:p>
     <w:p>
       <w:pPr>
-        <w:spacing w:after="140" w:line="340" w:lineRule="auto"/>
-        <w:jc w:val="both"/>
+        <w:spacing w:after="100" w:line="340" w:lineRule="auto"/>
+        <w:ind w:left="720" w:hanging="720"/>
+        <w:jc w:val="left"/>
       </w:pPr>
       <w:r>
         <w:rPr>
@@ -19600,8 +19623,9 @@
     </w:p>
     <w:p>
       <w:pPr>
-        <w:spacing w:after="140" w:line="340" w:lineRule="auto"/>
-        <w:jc w:val="both"/>
+        <w:spacing w:after="100" w:line="340" w:lineRule="auto"/>
+        <w:ind w:left="720" w:hanging="720"/>
+        <w:jc w:val="left"/>
       </w:pPr>
       <w:r>
         <w:rPr>
@@ -19666,8 +19690,9 @@
     </w:p>
     <w:p>
       <w:pPr>
-        <w:spacing w:after="140" w:line="340" w:lineRule="auto"/>
-        <w:jc w:val="both"/>
+        <w:spacing w:after="100" w:line="340" w:lineRule="auto"/>
+        <w:ind w:left="720" w:hanging="720"/>
+        <w:jc w:val="left"/>
       </w:pPr>
       <w:r>
         <w:rPr>
@@ -19732,8 +19757,9 @@
     </w:p>
     <w:p>
       <w:pPr>
-        <w:spacing w:after="140" w:line="340" w:lineRule="auto"/>
-        <w:jc w:val="both"/>
+        <w:spacing w:after="100" w:line="340" w:lineRule="auto"/>
+        <w:ind w:left="720" w:hanging="720"/>
+        <w:jc w:val="left"/>
       </w:pPr>
       <w:r>
         <w:rPr>
@@ -19798,8 +19824,9 @@
     </w:p>
     <w:p>
       <w:pPr>
-        <w:spacing w:after="140" w:line="340" w:lineRule="auto"/>
-        <w:jc w:val="both"/>
+        <w:spacing w:after="100" w:line="340" w:lineRule="auto"/>
+        <w:ind w:left="720" w:hanging="720"/>
+        <w:jc w:val="left"/>
       </w:pPr>
       <w:r>
         <w:rPr>
@@ -19864,8 +19891,9 @@
     </w:p>
     <w:p>
       <w:pPr>
-        <w:spacing w:after="140" w:line="340" w:lineRule="auto"/>
-        <w:jc w:val="both"/>
+        <w:spacing w:after="100" w:line="340" w:lineRule="auto"/>
+        <w:ind w:left="720" w:hanging="720"/>
+        <w:jc w:val="left"/>
       </w:pPr>
       <w:r>
         <w:rPr>
@@ -19930,8 +19958,9 @@
     </w:p>
     <w:p>
       <w:pPr>
-        <w:spacing w:after="140" w:line="340" w:lineRule="auto"/>
-        <w:jc w:val="both"/>
+        <w:spacing w:after="100" w:line="340" w:lineRule="auto"/>
+        <w:ind w:left="720" w:hanging="720"/>
+        <w:jc w:val="left"/>
       </w:pPr>
       <w:r>
         <w:rPr>
@@ -19996,8 +20025,9 @@
     </w:p>
     <w:p>
       <w:pPr>
-        <w:spacing w:after="140" w:line="340" w:lineRule="auto"/>
-        <w:jc w:val="both"/>
+        <w:spacing w:after="100" w:line="340" w:lineRule="auto"/>
+        <w:ind w:left="720" w:hanging="720"/>
+        <w:jc w:val="left"/>
       </w:pPr>
       <w:r>
         <w:rPr>
@@ -20062,8 +20092,9 @@
     </w:p>
     <w:p>
       <w:pPr>
-        <w:spacing w:after="140" w:line="340" w:lineRule="auto"/>
-        <w:jc w:val="both"/>
+        <w:spacing w:after="100" w:line="340" w:lineRule="auto"/>
+        <w:ind w:left="720" w:hanging="720"/>
+        <w:jc w:val="left"/>
       </w:pPr>
       <w:r>
         <w:rPr>
@@ -20128,8 +20159,9 @@
     </w:p>
     <w:p>
       <w:pPr>
-        <w:spacing w:after="140" w:line="340" w:lineRule="auto"/>
-        <w:jc w:val="both"/>
+        <w:spacing w:after="100" w:line="340" w:lineRule="auto"/>
+        <w:ind w:left="720" w:hanging="720"/>
+        <w:jc w:val="left"/>
       </w:pPr>
       <w:r>
         <w:rPr>
@@ -20194,8 +20226,9 @@
     </w:p>
     <w:p>
       <w:pPr>
-        <w:spacing w:after="140" w:line="340" w:lineRule="auto"/>
-        <w:jc w:val="both"/>
+        <w:spacing w:after="100" w:line="340" w:lineRule="auto"/>
+        <w:ind w:left="720" w:hanging="720"/>
+        <w:jc w:val="left"/>
       </w:pPr>
       <w:r>
         <w:rPr>
@@ -20260,8 +20293,9 @@
     </w:p>
     <w:p>
       <w:pPr>
-        <w:spacing w:after="140" w:line="340" w:lineRule="auto"/>
-        <w:jc w:val="both"/>
+        <w:spacing w:after="100" w:line="340" w:lineRule="auto"/>
+        <w:ind w:left="720" w:hanging="720"/>
+        <w:jc w:val="left"/>
       </w:pPr>
       <w:r>
         <w:rPr>
@@ -20302,8 +20336,9 @@
     </w:p>
     <w:p>
       <w:pPr>
-        <w:spacing w:after="140" w:line="340" w:lineRule="auto"/>
-        <w:jc w:val="both"/>
+        <w:spacing w:after="100" w:line="340" w:lineRule="auto"/>
+        <w:ind w:left="720" w:hanging="720"/>
+        <w:jc w:val="left"/>
       </w:pPr>
       <w:r>
         <w:rPr>
@@ -20368,8 +20403,9 @@
     </w:p>
     <w:p>
       <w:pPr>
-        <w:spacing w:after="140" w:line="340" w:lineRule="auto"/>
-        <w:jc w:val="both"/>
+        <w:spacing w:after="100" w:line="340" w:lineRule="auto"/>
+        <w:ind w:left="720" w:hanging="720"/>
+        <w:jc w:val="left"/>
       </w:pPr>
       <w:r>
         <w:rPr>
@@ -20434,8 +20470,9 @@
     </w:p>
     <w:p>
       <w:pPr>
-        <w:spacing w:after="140" w:line="340" w:lineRule="auto"/>
-        <w:jc w:val="both"/>
+        <w:spacing w:after="100" w:line="340" w:lineRule="auto"/>
+        <w:ind w:left="720" w:hanging="720"/>
+        <w:jc w:val="left"/>
       </w:pPr>
       <w:r>
         <w:rPr>
@@ -20476,8 +20513,9 @@
     </w:p>
     <w:p>
       <w:pPr>
-        <w:spacing w:after="140" w:line="340" w:lineRule="auto"/>
-        <w:jc w:val="both"/>
+        <w:spacing w:after="100" w:line="340" w:lineRule="auto"/>
+        <w:ind w:left="720" w:hanging="720"/>
+        <w:jc w:val="left"/>
       </w:pPr>
       <w:r>
         <w:rPr>
@@ -20558,8 +20596,9 @@
     </w:p>
     <w:p>
       <w:pPr>
-        <w:spacing w:after="140" w:line="340" w:lineRule="auto"/>
-        <w:jc w:val="both"/>
+        <w:spacing w:after="100" w:line="340" w:lineRule="auto"/>
+        <w:ind w:left="720" w:hanging="720"/>
+        <w:jc w:val="left"/>
       </w:pPr>
       <w:r>
         <w:rPr>
@@ -20576,8 +20615,9 @@
     </w:p>
     <w:p>
       <w:pPr>
-        <w:spacing w:after="140" w:line="340" w:lineRule="auto"/>
-        <w:jc w:val="both"/>
+        <w:spacing w:after="100" w:line="340" w:lineRule="auto"/>
+        <w:ind w:left="720" w:hanging="720"/>
+        <w:jc w:val="left"/>
       </w:pPr>
       <w:r>
         <w:rPr>
@@ -20594,8 +20634,9 @@
     </w:p>
     <w:p>
       <w:pPr>
-        <w:spacing w:after="140" w:line="340" w:lineRule="auto"/>
-        <w:jc w:val="both"/>
+        <w:spacing w:after="100" w:line="340" w:lineRule="auto"/>
+        <w:ind w:left="720" w:hanging="720"/>
+        <w:jc w:val="left"/>
       </w:pPr>
       <w:r>
         <w:rPr>

</xml_diff>

<commit_message>
synopsis: the title page was set as justified body prose
Everything on it — the title, the degree, the candidate, the university — went
through the body-paragraph path, so the title's words were stretched apart to
reach the right margin and the whole page sat in its top third against the left
edge. A submission title page is centred, with the title in bold.

The rule is positional — everything before the first page break is title-page
matter — rather than a list of strings to match, so it keeps working if the
front matter is reworded. The declaration page that follows stays flush left,
which is what that form wants.

Co-Authored-By: Claude Opus 5 <noreply@anthropic.com>
Claude-Session: https://claude.ai/code/session_01Y21CLUtoD2HT4KcbvaYcRZ
</commit_message>
<xml_diff>
--- a/synopsis/Synopsis_Gyandeep_Nath_AdtU.docx
+++ b/synopsis/Synopsis_Gyandeep_Nath_AdtU.docx
@@ -4,26 +4,26 @@
   <w:body>
     <w:p>
       <w:pPr>
-        <w:spacing w:after="140" w:line="340" w:lineRule="auto"/>
-        <w:jc w:val="both"/>
-      </w:pPr>
-      <w:r>
-        <w:rPr>
-          <w:rFonts w:ascii="Times New Roman" w:cs="Times New Roman" w:eastAsia="Times New Roman" w:hAnsi="Times New Roman"/>
-          <w:b w:val="false"/>
-          <w:bCs w:val="false"/>
-          <w:i w:val="false"/>
-          <w:iCs w:val="false"/>
-          <w:sz w:val="24"/>
-          <w:szCs w:val="24"/>
+        <w:spacing w:after="400" w:before="1400" w:line="360" w:lineRule="auto"/>
+        <w:jc w:val="center"/>
+      </w:pPr>
+      <w:r>
+        <w:rPr>
+          <w:rFonts w:ascii="Times New Roman" w:cs="Times New Roman" w:eastAsia="Times New Roman" w:hAnsi="Times New Roman"/>
+          <w:b/>
+          <w:bCs/>
+          <w:i w:val="false"/>
+          <w:iCs w:val="false"/>
+          <w:sz w:val="28"/>
+          <w:szCs w:val="28"/>
         </w:rPr>
         <w:t xml:space="preserve">EFFECTS OF DISPLAY POLARITY AND TEXT COLOUR ON VISUAL FATIGUE, OCULAR BEHAVIOUR AND TASK PERFORMANCE UNDER CONTROLLED AMBIENT ILLUMINATION</w:t>
       </w:r>
     </w:p>
     <w:p>
       <w:pPr>
-        <w:spacing w:after="140" w:line="340" w:lineRule="auto"/>
-        <w:jc w:val="both"/>
+        <w:spacing w:after="200" w:before="60" w:line="340" w:lineRule="auto"/>
+        <w:jc w:val="center"/>
       </w:pPr>
       <w:r>
         <w:rPr>
@@ -40,8 +40,8 @@
     </w:p>
     <w:p>
       <w:pPr>
-        <w:spacing w:after="140" w:line="340" w:lineRule="auto"/>
-        <w:jc w:val="both"/>
+        <w:spacing w:after="200" w:before="60" w:line="340" w:lineRule="auto"/>
+        <w:jc w:val="center"/>
       </w:pPr>
       <w:r>
         <w:rPr>
@@ -58,8 +58,8 @@
     </w:p>
     <w:p>
       <w:pPr>
-        <w:spacing w:after="140" w:line="340" w:lineRule="auto"/>
-        <w:jc w:val="both"/>
+        <w:spacing w:after="200" w:before="60" w:line="340" w:lineRule="auto"/>
+        <w:jc w:val="center"/>
       </w:pPr>
       <w:r>
         <w:rPr>
@@ -76,8 +76,8 @@
     </w:p>
     <w:p>
       <w:pPr>
-        <w:spacing w:after="140" w:line="340" w:lineRule="auto"/>
-        <w:jc w:val="both"/>
+        <w:spacing w:after="200" w:before="60" w:line="340" w:lineRule="auto"/>
+        <w:jc w:val="center"/>
       </w:pPr>
       <w:r>
         <w:rPr>
@@ -94,8 +94,8 @@
     </w:p>
     <w:p>
       <w:pPr>
-        <w:spacing w:after="140" w:line="340" w:lineRule="auto"/>
-        <w:jc w:val="both"/>
+        <w:spacing w:after="200" w:before="60" w:line="340" w:lineRule="auto"/>
+        <w:jc w:val="center"/>
       </w:pPr>
       <w:r>
         <w:rPr>
@@ -112,8 +112,8 @@
     </w:p>
     <w:p>
       <w:pPr>
-        <w:spacing w:after="140" w:line="340" w:lineRule="auto"/>
-        <w:jc w:val="both"/>
+        <w:spacing w:after="200" w:before="60" w:line="340" w:lineRule="auto"/>
+        <w:jc w:val="center"/>
       </w:pPr>
       <w:r>
         <w:rPr>
@@ -130,8 +130,8 @@
     </w:p>
     <w:p>
       <w:pPr>
-        <w:spacing w:after="140" w:line="340" w:lineRule="auto"/>
-        <w:jc w:val="both"/>
+        <w:spacing w:after="200" w:before="60" w:line="340" w:lineRule="auto"/>
+        <w:jc w:val="center"/>
       </w:pPr>
       <w:r>
         <w:rPr>
@@ -148,8 +148,8 @@
     </w:p>
     <w:p>
       <w:pPr>
-        <w:spacing w:after="140" w:line="340" w:lineRule="auto"/>
-        <w:jc w:val="both"/>
+        <w:spacing w:after="200" w:before="60" w:line="340" w:lineRule="auto"/>
+        <w:jc w:val="center"/>
       </w:pPr>
       <w:r>
         <w:rPr>
@@ -166,8 +166,8 @@
     </w:p>
     <w:p>
       <w:pPr>
-        <w:spacing w:after="140" w:line="340" w:lineRule="auto"/>
-        <w:jc w:val="both"/>
+        <w:spacing w:after="200" w:before="60" w:line="340" w:lineRule="auto"/>
+        <w:jc w:val="center"/>
       </w:pPr>
       <w:r>
         <w:rPr>
@@ -184,8 +184,8 @@
     </w:p>
     <w:p>
       <w:pPr>
-        <w:spacing w:after="140" w:line="340" w:lineRule="auto"/>
-        <w:jc w:val="both"/>
+        <w:spacing w:after="200" w:before="60" w:line="340" w:lineRule="auto"/>
+        <w:jc w:val="center"/>
       </w:pPr>
       <w:r>
         <w:rPr>

</xml_diff>